<commit_message>
Rename project to DAK
</commit_message>
<xml_diff>
--- a/docs/01_Brand_Identity_v4.0.docx
+++ b/docs/01_Brand_Identity_v4.0.docx
@@ -45,6 +45,14 @@
     </w:p>
     <w:sdt>
       <w:sdtPr>
+        <w:rPr>
+          <w:rFonts w:asciiTheme="minorHAnsi" w:eastAsiaTheme="minorEastAsia" w:hAnsiTheme="minorHAnsi" w:cstheme="minorBidi"/>
+          <w:b w:val="0"/>
+          <w:bCs w:val="0"/>
+          <w:color w:val="auto"/>
+          <w:sz w:val="22"/>
+          <w:szCs w:val="22"/>
+        </w:rPr>
         <w:id w:val="2004075257"/>
         <w:docPartObj>
           <w:docPartGallery w:val="Table of Contents"/>
@@ -53,11 +61,7 @@
       </w:sdtPr>
       <w:sdtEndPr>
         <w:rPr>
-          <w:rFonts w:asciiTheme="minorHAnsi" w:eastAsiaTheme="minorEastAsia" w:hAnsiTheme="minorHAnsi" w:cstheme="minorBidi"/>
           <w:noProof/>
-          <w:color w:val="auto"/>
-          <w:sz w:val="22"/>
-          <w:szCs w:val="22"/>
         </w:rPr>
       </w:sdtEndPr>
       <w:sdtContent>
@@ -994,7 +998,7 @@
     <w:p>
       <w:pPr>
         <w:rPr>
-          <w:rFonts w:eastAsia="맑은 고딕" w:hint="eastAsia"/>
+          <w:rFonts w:eastAsia="맑은 고딕"/>
           <w:lang w:eastAsia="ko-KR"/>
         </w:rPr>
       </w:pPr>
@@ -1029,7 +1033,7 @@
       <w:pPr>
         <w:pStyle w:val="NormalWeb"/>
         <w:rPr>
-          <w:rFonts w:asciiTheme="minorHAnsi" w:hAnsiTheme="minorHAnsi"/>
+          <w:rFonts w:asciiTheme="minorHAnsi" w:eastAsia="맑은 고딕" w:hAnsiTheme="minorHAnsi" w:hint="eastAsia"/>
         </w:rPr>
       </w:pPr>
       <w:r>
@@ -1037,7 +1041,7 @@
           <w:rStyle w:val="Strong"/>
           <w:rFonts w:asciiTheme="minorHAnsi" w:hAnsiTheme="minorHAnsi"/>
         </w:rPr>
-        <w:t>[Project Name]</w:t>
+        <w:t>Discover Adelaide Korea</w:t>
       </w:r>
       <w:r>
         <w:rPr>
@@ -1048,52 +1052,52 @@
       <w:r>
         <w:rPr>
           <w:rStyle w:val="Emphasis"/>
+          <w:rFonts w:asciiTheme="minorHAnsi" w:eastAsia="맑은 고딕" w:hAnsiTheme="minorHAnsi" w:hint="eastAsia"/>
+        </w:rPr>
+        <w:t>(DAK)</w:t>
+      </w:r>
+    </w:p>
+    <w:p>
+      <w:r>
+        <w:pict w14:anchorId="2650A44F">
+          <v:rect id="_x0000_i1025" style="width:0;height:1.5pt" o:hralign="center" o:hrstd="t" o:hr="t" fillcolor="#a0a0a0" stroked="f"/>
+        </w:pict>
+      </w:r>
+    </w:p>
+    <w:p>
+      <w:pPr>
+        <w:pStyle w:val="Heading2"/>
+        <w:rPr>
           <w:rFonts w:asciiTheme="minorHAnsi" w:hAnsiTheme="minorHAnsi"/>
         </w:rPr>
-        <w:t>(Working Title)</w:t>
-      </w:r>
-    </w:p>
-    <w:p>
-      <w:r>
-        <w:pict w14:anchorId="2650A44F">
-          <v:rect id="_x0000_i2162" style="width:0;height:1.5pt" o:hralign="center" o:hrstd="t" o:hr="t" fillcolor="#a0a0a0" stroked="f"/>
-        </w:pict>
-      </w:r>
-    </w:p>
-    <w:p>
-      <w:pPr>
-        <w:pStyle w:val="Heading2"/>
+      </w:pPr>
+      <w:bookmarkStart w:id="3" w:name="_Toc235186550"/>
+      <w:r>
         <w:rPr>
           <w:rFonts w:asciiTheme="minorHAnsi" w:hAnsiTheme="minorHAnsi"/>
         </w:rPr>
-      </w:pPr>
-      <w:bookmarkStart w:id="3" w:name="_Toc235186550"/>
-      <w:r>
+        <w:t>One-line Brand Description</w:t>
+      </w:r>
+      <w:bookmarkEnd w:id="3"/>
+    </w:p>
+    <w:p>
+      <w:pPr>
+        <w:pStyle w:val="NormalWeb"/>
         <w:rPr>
           <w:rFonts w:asciiTheme="minorHAnsi" w:hAnsiTheme="minorHAnsi"/>
         </w:rPr>
-        <w:t>One-line Brand Description</w:t>
-      </w:r>
-      <w:bookmarkEnd w:id="3"/>
-    </w:p>
-    <w:p>
-      <w:pPr>
-        <w:pStyle w:val="NormalWeb"/>
+      </w:pPr>
+      <w:r>
         <w:rPr>
           <w:rFonts w:asciiTheme="minorHAnsi" w:hAnsiTheme="minorHAnsi"/>
         </w:rPr>
-      </w:pPr>
-      <w:r>
-        <w:rPr>
-          <w:rFonts w:asciiTheme="minorHAnsi" w:hAnsiTheme="minorHAnsi"/>
-        </w:rPr>
         <w:t>An AI-powered Korean local lifestyle platform that helps people discover trusted information, businesses, services, and community resources in Adelaide.</w:t>
       </w:r>
     </w:p>
     <w:p>
       <w:r>
         <w:pict w14:anchorId="7EBC38D9">
-          <v:rect id="_x0000_i2163" style="width:0;height:1.5pt" o:hralign="center" o:hrstd="t" o:hr="t" fillcolor="#a0a0a0" stroked="f"/>
+          <v:rect id="_x0000_i1026" style="width:0;height:1.5pt" o:hralign="center" o:hrstd="t" o:hr="t" fillcolor="#a0a0a0" stroked="f"/>
         </w:pict>
       </w:r>
     </w:p>
@@ -1126,7 +1130,7 @@
           <w:rStyle w:val="Strong"/>
           <w:rFonts w:asciiTheme="minorHAnsi" w:hAnsiTheme="minorHAnsi"/>
         </w:rPr>
-        <w:t>[Project Name]</w:t>
+        <w:t>Discover Adelaide Korea</w:t>
       </w:r>
       <w:r>
         <w:rPr>
@@ -1153,7 +1157,7 @@
           <w:rStyle w:val="Strong"/>
           <w:rFonts w:asciiTheme="minorHAnsi" w:hAnsiTheme="minorHAnsi"/>
         </w:rPr>
-        <w:t>[Project Name]</w:t>
+        <w:t>Discover Adelaide Korea</w:t>
       </w:r>
       <w:r>
         <w:rPr>
@@ -1193,7 +1197,7 @@
     <w:p>
       <w:r>
         <w:pict w14:anchorId="15DDC7FB">
-          <v:rect id="_x0000_i2164" style="width:0;height:1.5pt" o:hralign="center" o:hrstd="t" o:hr="t" fillcolor="#a0a0a0" stroked="f"/>
+          <v:rect id="_x0000_i1027" style="width:0;height:1.5pt" o:hralign="center" o:hrstd="t" o:hr="t" fillcolor="#a0a0a0" stroked="f"/>
         </w:pict>
       </w:r>
     </w:p>
@@ -1231,7 +1235,7 @@
           <w:rStyle w:val="Strong"/>
           <w:rFonts w:asciiTheme="minorHAnsi" w:hAnsiTheme="minorHAnsi"/>
         </w:rPr>
-        <w:t>[Project Name]</w:t>
+        <w:t>Discover Adelaide Korea</w:t>
       </w:r>
       <w:r>
         <w:rPr>
@@ -1295,7 +1299,7 @@
       <w:pPr>
         <w:pStyle w:val="NormalWeb"/>
         <w:rPr>
-          <w:rFonts w:asciiTheme="minorHAnsi" w:eastAsia="맑은 고딕" w:hAnsiTheme="minorHAnsi" w:hint="eastAsia"/>
+          <w:rFonts w:asciiTheme="minorHAnsi" w:eastAsia="맑은 고딕" w:hAnsiTheme="minorHAnsi"/>
         </w:rPr>
       </w:pPr>
     </w:p>
@@ -1309,7 +1313,6 @@
       </w:pPr>
       <w:bookmarkStart w:id="6" w:name="_Toc235186553"/>
       <w:r>
-        <w:lastRenderedPageBreak/>
         <w:t xml:space="preserve">2. </w:t>
       </w:r>
       <w:r>
@@ -1379,7 +1382,7 @@
           <w:lang w:val="en-AU" w:eastAsia="ko-KR"/>
         </w:rPr>
         <w:pict w14:anchorId="1F4DE30F">
-          <v:rect id="_x0000_i2165" style="width:0;height:1.5pt" o:hralign="center" o:hrstd="t" o:hr="t" fillcolor="#a0a0a0" stroked="f"/>
+          <v:rect id="_x0000_i1028" style="width:0;height:1.5pt" o:hralign="center" o:hrstd="t" o:hr="t" fillcolor="#a0a0a0" stroked="f"/>
         </w:pict>
       </w:r>
     </w:p>
@@ -1416,7 +1419,7 @@
           <w:bCs/>
           <w:lang w:val="en-AU" w:eastAsia="ko-KR"/>
         </w:rPr>
-        <w:t>[Project Name]</w:t>
+        <w:t>Discover Adelaide Korea</w:t>
       </w:r>
       <w:r>
         <w:rPr>
@@ -1469,7 +1472,7 @@
           <w:lang w:val="en-AU" w:eastAsia="ko-KR"/>
         </w:rPr>
         <w:pict w14:anchorId="0A0C8B92">
-          <v:rect id="_x0000_i2166" style="width:0;height:1.5pt" o:hralign="center" o:hrstd="t" o:hr="t" fillcolor="#a0a0a0" stroked="f"/>
+          <v:rect id="_x0000_i1029" style="width:0;height:1.5pt" o:hralign="center" o:hrstd="t" o:hr="t" fillcolor="#a0a0a0" stroked="f"/>
         </w:pict>
       </w:r>
     </w:p>
@@ -1630,7 +1633,7 @@
           <w:lang w:val="en-AU" w:eastAsia="ko-KR"/>
         </w:rPr>
         <w:pict w14:anchorId="1E5320B4">
-          <v:rect id="_x0000_i2167" style="width:0;height:1.5pt" o:hralign="center" o:hrstd="t" o:hr="t" fillcolor="#a0a0a0" stroked="f"/>
+          <v:rect id="_x0000_i1030" style="width:0;height:1.5pt" o:hralign="center" o:hrstd="t" o:hr="t" fillcolor="#a0a0a0" stroked="f"/>
         </w:pict>
       </w:r>
     </w:p>
@@ -1643,97 +1646,83 @@
           <w:lang w:val="en-AU" w:eastAsia="ko-KR"/>
         </w:rPr>
       </w:pPr>
-      <w:r>
+    </w:p>
+    <w:p>
+      <w:pPr>
         <w:rPr>
           <w:rFonts w:eastAsia="맑은 고딕"/>
           <w:b/>
           <w:bCs/>
           <w:lang w:val="en-AU" w:eastAsia="ko-KR"/>
         </w:rPr>
-        <w:t>Our Commitment</w:t>
-      </w:r>
-    </w:p>
-    <w:p>
-      <w:pPr>
-        <w:rPr>
-          <w:rFonts w:eastAsia="맑은 고딕"/>
-          <w:lang w:val="en-AU" w:eastAsia="ko-KR"/>
-        </w:rPr>
-      </w:pPr>
-      <w:r>
-        <w:rPr>
-          <w:rFonts w:eastAsia="맑은 고딕"/>
-          <w:lang w:val="en-AU" w:eastAsia="ko-KR"/>
-        </w:rPr>
-        <w:t>We are committed to building more than just an information website.</w:t>
-      </w:r>
-    </w:p>
-    <w:p>
-      <w:pPr>
-        <w:rPr>
-          <w:rFonts w:eastAsia="맑은 고딕"/>
-          <w:lang w:val="en-AU" w:eastAsia="ko-KR"/>
-        </w:rPr>
-      </w:pPr>
-      <w:r>
-        <w:rPr>
-          <w:rFonts w:eastAsia="맑은 고딕"/>
-          <w:lang w:val="en-AU" w:eastAsia="ko-KR"/>
-        </w:rPr>
-        <w:lastRenderedPageBreak/>
-        <w:t>Our goal is to create a trusted digital platform that connects people with local businesses, community resources, practical guides, and verified information through a modern user experience supported by intelligent technology.</w:t>
-      </w:r>
-    </w:p>
-    <w:p>
-      <w:pPr>
-        <w:rPr>
-          <w:rFonts w:eastAsia="맑은 고딕"/>
-          <w:lang w:val="en-AU" w:eastAsia="ko-KR"/>
-        </w:rPr>
-      </w:pPr>
-      <w:r>
-        <w:rPr>
-          <w:rFonts w:eastAsia="맑은 고딕"/>
-          <w:lang w:val="en-AU" w:eastAsia="ko-KR"/>
-        </w:rPr>
-        <w:pict w14:anchorId="761A69DC">
-          <v:rect id="_x0000_i2168" style="width:0;height:1.5pt" o:hralign="center" o:hrstd="t" o:hr="t" fillcolor="#a0a0a0" stroked="f"/>
-        </w:pict>
-      </w:r>
-    </w:p>
-    <w:p>
-      <w:pPr>
+      </w:pPr>
+      <w:r>
         <w:rPr>
           <w:rFonts w:eastAsia="맑은 고딕"/>
           <w:b/>
           <w:bCs/>
           <w:lang w:val="en-AU" w:eastAsia="ko-KR"/>
         </w:rPr>
-      </w:pPr>
-      <w:r>
+        <w:lastRenderedPageBreak/>
+        <w:t>Our Commitment</w:t>
+      </w:r>
+    </w:p>
+    <w:p>
+      <w:pPr>
+        <w:rPr>
+          <w:rFonts w:eastAsia="맑은 고딕"/>
+          <w:lang w:val="en-AU" w:eastAsia="ko-KR"/>
+        </w:rPr>
+      </w:pPr>
+      <w:r>
+        <w:rPr>
+          <w:rFonts w:eastAsia="맑은 고딕"/>
+          <w:lang w:val="en-AU" w:eastAsia="ko-KR"/>
+        </w:rPr>
+        <w:t>We are committed to building more than just an information website.</w:t>
+      </w:r>
+    </w:p>
+    <w:p>
+      <w:pPr>
+        <w:rPr>
+          <w:rFonts w:eastAsia="맑은 고딕"/>
+          <w:lang w:val="en-AU" w:eastAsia="ko-KR"/>
+        </w:rPr>
+      </w:pPr>
+      <w:r>
+        <w:rPr>
+          <w:rFonts w:eastAsia="맑은 고딕"/>
+          <w:lang w:val="en-AU" w:eastAsia="ko-KR"/>
+        </w:rPr>
+        <w:t>Our goal is to create a trusted digital platform that connects people with local businesses, community resources, practical guides, and verified information through a modern user experience supported by intelligent technology.</w:t>
+      </w:r>
+    </w:p>
+    <w:p>
+      <w:pPr>
+        <w:rPr>
+          <w:rFonts w:eastAsia="맑은 고딕"/>
+          <w:lang w:val="en-AU" w:eastAsia="ko-KR"/>
+        </w:rPr>
+      </w:pPr>
+      <w:r>
+        <w:rPr>
+          <w:rFonts w:eastAsia="맑은 고딕"/>
+          <w:lang w:val="en-AU" w:eastAsia="ko-KR"/>
+        </w:rPr>
+        <w:pict w14:anchorId="761A69DC">
+          <v:rect id="_x0000_i1031" style="width:0;height:1.5pt" o:hralign="center" o:hrstd="t" o:hr="t" fillcolor="#a0a0a0" stroked="f"/>
+        </w:pict>
+      </w:r>
+    </w:p>
+    <w:p>
+      <w:pPr>
         <w:rPr>
           <w:rFonts w:eastAsia="맑은 고딕"/>
           <w:b/>
           <w:bCs/>
           <w:lang w:val="en-AU" w:eastAsia="ko-KR"/>
         </w:rPr>
-        <w:t>Long-term Story</w:t>
-      </w:r>
-    </w:p>
-    <w:p>
-      <w:pPr>
-        <w:rPr>
-          <w:rFonts w:eastAsia="맑은 고딕"/>
-          <w:lang w:val="en-AU" w:eastAsia="ko-KR"/>
-        </w:rPr>
-      </w:pPr>
-      <w:r>
-        <w:rPr>
-          <w:rFonts w:eastAsia="맑은 고딕"/>
-          <w:lang w:val="en-AU" w:eastAsia="ko-KR"/>
-        </w:rPr>
-        <w:t xml:space="preserve">We envision a future where </w:t>
-      </w:r>
+      </w:pPr>
       <w:r>
         <w:rPr>
           <w:rFonts w:eastAsia="맑은 고딕"/>
@@ -1741,215 +1730,221 @@
           <w:bCs/>
           <w:lang w:val="en-AU" w:eastAsia="ko-KR"/>
         </w:rPr>
-        <w:t>[Project Name]</w:t>
-      </w:r>
-      <w:r>
-        <w:rPr>
-          <w:rFonts w:eastAsia="맑은 고딕"/>
-          <w:lang w:val="en-AU" w:eastAsia="ko-KR"/>
-        </w:rPr>
-        <w:t xml:space="preserve"> becomes the first destination Koreans visit whenever they need information about Adelaide.</w:t>
-      </w:r>
-    </w:p>
-    <w:p>
-      <w:pPr>
-        <w:rPr>
-          <w:rFonts w:eastAsia="맑은 고딕"/>
-          <w:lang w:val="en-AU" w:eastAsia="ko-KR"/>
-        </w:rPr>
-      </w:pPr>
-      <w:r>
-        <w:rPr>
-          <w:rFonts w:eastAsia="맑은 고딕"/>
-          <w:lang w:val="en-AU" w:eastAsia="ko-KR"/>
-        </w:rPr>
-        <w:t>As the platform grows, the same trusted experience can expand to other Australian cities, creating a connected ecosystem that supports Korean communities across the country.</w:t>
-      </w:r>
-    </w:p>
-    <w:p>
-      <w:pPr>
-        <w:rPr>
-          <w:rFonts w:eastAsia="맑은 고딕"/>
-          <w:lang w:val="en-AU" w:eastAsia="ko-KR"/>
-        </w:rPr>
-      </w:pPr>
-    </w:p>
-    <w:p>
-      <w:pPr>
-        <w:rPr>
-          <w:rFonts w:eastAsia="맑은 고딕"/>
-          <w:lang w:val="en-AU" w:eastAsia="ko-KR"/>
-        </w:rPr>
-      </w:pPr>
-    </w:p>
-    <w:p>
-      <w:pPr>
-        <w:rPr>
-          <w:rFonts w:eastAsia="맑은 고딕"/>
-          <w:lang w:val="en-AU" w:eastAsia="ko-KR"/>
-        </w:rPr>
-      </w:pPr>
-    </w:p>
-    <w:p>
-      <w:pPr>
-        <w:rPr>
-          <w:rFonts w:eastAsia="맑은 고딕"/>
-          <w:lang w:val="en-AU" w:eastAsia="ko-KR"/>
-        </w:rPr>
-      </w:pPr>
-    </w:p>
-    <w:p>
-      <w:pPr>
-        <w:rPr>
-          <w:rFonts w:eastAsia="맑은 고딕"/>
-          <w:lang w:val="en-AU" w:eastAsia="ko-KR"/>
-        </w:rPr>
-      </w:pPr>
-    </w:p>
-    <w:p>
-      <w:pPr>
-        <w:rPr>
-          <w:rFonts w:eastAsia="맑은 고딕"/>
-          <w:lang w:val="en-AU" w:eastAsia="ko-KR"/>
-        </w:rPr>
-      </w:pPr>
-    </w:p>
-    <w:p>
-      <w:pPr>
-        <w:rPr>
-          <w:rFonts w:eastAsia="맑은 고딕"/>
-          <w:lang w:val="en-AU" w:eastAsia="ko-KR"/>
-        </w:rPr>
-      </w:pPr>
-    </w:p>
-    <w:p>
-      <w:pPr>
-        <w:rPr>
-          <w:rFonts w:eastAsia="맑은 고딕"/>
-          <w:lang w:val="en-AU" w:eastAsia="ko-KR"/>
-        </w:rPr>
-      </w:pPr>
-    </w:p>
-    <w:p>
-      <w:pPr>
-        <w:rPr>
-          <w:rFonts w:eastAsia="맑은 고딕"/>
-          <w:lang w:val="en-AU" w:eastAsia="ko-KR"/>
-        </w:rPr>
-      </w:pPr>
-    </w:p>
-    <w:p>
-      <w:pPr>
-        <w:rPr>
-          <w:rFonts w:eastAsia="맑은 고딕"/>
-          <w:lang w:val="en-AU" w:eastAsia="ko-KR"/>
-        </w:rPr>
-      </w:pPr>
-    </w:p>
-    <w:p>
-      <w:pPr>
-        <w:rPr>
-          <w:rFonts w:eastAsia="맑은 고딕"/>
-          <w:lang w:val="en-AU" w:eastAsia="ko-KR"/>
-        </w:rPr>
-      </w:pPr>
-    </w:p>
-    <w:p>
-      <w:pPr>
-        <w:rPr>
-          <w:rFonts w:eastAsia="맑은 고딕"/>
-          <w:lang w:val="en-AU" w:eastAsia="ko-KR"/>
-        </w:rPr>
-      </w:pPr>
-    </w:p>
-    <w:p>
-      <w:pPr>
-        <w:rPr>
-          <w:rFonts w:eastAsia="맑은 고딕"/>
-          <w:lang w:val="en-AU" w:eastAsia="ko-KR"/>
-        </w:rPr>
-      </w:pPr>
-    </w:p>
-    <w:p>
-      <w:pPr>
-        <w:rPr>
-          <w:rFonts w:eastAsia="맑은 고딕"/>
-          <w:lang w:val="en-AU" w:eastAsia="ko-KR"/>
-        </w:rPr>
-      </w:pPr>
-    </w:p>
-    <w:p>
-      <w:pPr>
-        <w:rPr>
-          <w:rFonts w:eastAsia="맑은 고딕"/>
-          <w:lang w:val="en-AU" w:eastAsia="ko-KR"/>
-        </w:rPr>
-      </w:pPr>
-    </w:p>
-    <w:p>
-      <w:pPr>
-        <w:rPr>
-          <w:rFonts w:eastAsia="맑은 고딕"/>
-          <w:lang w:val="en-AU" w:eastAsia="ko-KR"/>
-        </w:rPr>
-      </w:pPr>
-    </w:p>
-    <w:p>
-      <w:pPr>
-        <w:rPr>
-          <w:rFonts w:eastAsia="맑은 고딕"/>
-          <w:lang w:val="en-AU" w:eastAsia="ko-KR"/>
-        </w:rPr>
-      </w:pPr>
-    </w:p>
-    <w:p>
-      <w:pPr>
-        <w:rPr>
-          <w:rFonts w:eastAsia="맑은 고딕" w:hint="eastAsia"/>
-          <w:lang w:val="en-AU" w:eastAsia="ko-KR"/>
-        </w:rPr>
-      </w:pPr>
-    </w:p>
-    <w:p>
-      <w:pPr>
-        <w:pStyle w:val="Heading2"/>
-        <w:rPr>
-          <w:rFonts w:eastAsia="맑은 고딕"/>
-          <w:lang w:eastAsia="ko-KR"/>
-        </w:rPr>
-      </w:pPr>
-      <w:bookmarkStart w:id="7" w:name="_Toc235186554"/>
-      <w:r>
-        <w:lastRenderedPageBreak/>
-        <w:t>3. Vision, Mission &amp; Purpose</w:t>
-      </w:r>
-      <w:bookmarkEnd w:id="7"/>
-    </w:p>
-    <w:p>
-      <w:pPr>
+        <w:t>Long-term Story</w:t>
+      </w:r>
+    </w:p>
+    <w:p>
+      <w:pPr>
+        <w:rPr>
+          <w:rFonts w:eastAsia="맑은 고딕"/>
+          <w:lang w:val="en-AU" w:eastAsia="ko-KR"/>
+        </w:rPr>
+      </w:pPr>
+      <w:r>
+        <w:rPr>
+          <w:rFonts w:eastAsia="맑은 고딕"/>
+          <w:lang w:val="en-AU" w:eastAsia="ko-KR"/>
+        </w:rPr>
+        <w:t xml:space="preserve">We envision a future where </w:t>
+      </w:r>
+      <w:r>
         <w:rPr>
           <w:rFonts w:eastAsia="맑은 고딕"/>
           <w:b/>
           <w:bCs/>
           <w:lang w:val="en-AU" w:eastAsia="ko-KR"/>
         </w:rPr>
-      </w:pPr>
-      <w:r>
+        <w:t>Discover Adelaide Korea</w:t>
+      </w:r>
+      <w:r>
+        <w:rPr>
+          <w:rFonts w:eastAsia="맑은 고딕"/>
+          <w:lang w:val="en-AU" w:eastAsia="ko-KR"/>
+        </w:rPr>
+        <w:t xml:space="preserve"> becomes the first destination Koreans visit whenever they need information about Adelaide.</w:t>
+      </w:r>
+    </w:p>
+    <w:p>
+      <w:pPr>
+        <w:rPr>
+          <w:rFonts w:eastAsia="맑은 고딕"/>
+          <w:lang w:val="en-AU" w:eastAsia="ko-KR"/>
+        </w:rPr>
+      </w:pPr>
+      <w:r>
+        <w:rPr>
+          <w:rFonts w:eastAsia="맑은 고딕"/>
+          <w:lang w:val="en-AU" w:eastAsia="ko-KR"/>
+        </w:rPr>
+        <w:t>As the platform grows, the same trusted experience can expand to other Australian cities, creating a connected ecosystem that supports Korean communities across the country.</w:t>
+      </w:r>
+    </w:p>
+    <w:p>
+      <w:pPr>
+        <w:rPr>
+          <w:rFonts w:eastAsia="맑은 고딕"/>
+          <w:lang w:val="en-AU" w:eastAsia="ko-KR"/>
+        </w:rPr>
+      </w:pPr>
+    </w:p>
+    <w:p>
+      <w:pPr>
+        <w:rPr>
+          <w:rFonts w:eastAsia="맑은 고딕"/>
+          <w:lang w:val="en-AU" w:eastAsia="ko-KR"/>
+        </w:rPr>
+      </w:pPr>
+    </w:p>
+    <w:p>
+      <w:pPr>
+        <w:rPr>
+          <w:rFonts w:eastAsia="맑은 고딕"/>
+          <w:lang w:val="en-AU" w:eastAsia="ko-KR"/>
+        </w:rPr>
+      </w:pPr>
+    </w:p>
+    <w:p>
+      <w:pPr>
+        <w:rPr>
+          <w:rFonts w:eastAsia="맑은 고딕"/>
+          <w:lang w:val="en-AU" w:eastAsia="ko-KR"/>
+        </w:rPr>
+      </w:pPr>
+    </w:p>
+    <w:p>
+      <w:pPr>
+        <w:rPr>
+          <w:rFonts w:eastAsia="맑은 고딕"/>
+          <w:lang w:val="en-AU" w:eastAsia="ko-KR"/>
+        </w:rPr>
+      </w:pPr>
+    </w:p>
+    <w:p>
+      <w:pPr>
+        <w:rPr>
+          <w:rFonts w:eastAsia="맑은 고딕"/>
+          <w:lang w:val="en-AU" w:eastAsia="ko-KR"/>
+        </w:rPr>
+      </w:pPr>
+    </w:p>
+    <w:p>
+      <w:pPr>
+        <w:rPr>
+          <w:rFonts w:eastAsia="맑은 고딕"/>
+          <w:lang w:val="en-AU" w:eastAsia="ko-KR"/>
+        </w:rPr>
+      </w:pPr>
+    </w:p>
+    <w:p>
+      <w:pPr>
+        <w:rPr>
+          <w:rFonts w:eastAsia="맑은 고딕"/>
+          <w:lang w:val="en-AU" w:eastAsia="ko-KR"/>
+        </w:rPr>
+      </w:pPr>
+    </w:p>
+    <w:p>
+      <w:pPr>
+        <w:rPr>
+          <w:rFonts w:eastAsia="맑은 고딕"/>
+          <w:lang w:val="en-AU" w:eastAsia="ko-KR"/>
+        </w:rPr>
+      </w:pPr>
+    </w:p>
+    <w:p>
+      <w:pPr>
+        <w:rPr>
+          <w:rFonts w:eastAsia="맑은 고딕"/>
+          <w:lang w:val="en-AU" w:eastAsia="ko-KR"/>
+        </w:rPr>
+      </w:pPr>
+    </w:p>
+    <w:p>
+      <w:pPr>
+        <w:rPr>
+          <w:rFonts w:eastAsia="맑은 고딕"/>
+          <w:lang w:val="en-AU" w:eastAsia="ko-KR"/>
+        </w:rPr>
+      </w:pPr>
+    </w:p>
+    <w:p>
+      <w:pPr>
+        <w:rPr>
+          <w:rFonts w:eastAsia="맑은 고딕"/>
+          <w:lang w:val="en-AU" w:eastAsia="ko-KR"/>
+        </w:rPr>
+      </w:pPr>
+    </w:p>
+    <w:p>
+      <w:pPr>
+        <w:rPr>
+          <w:rFonts w:eastAsia="맑은 고딕"/>
+          <w:lang w:val="en-AU" w:eastAsia="ko-KR"/>
+        </w:rPr>
+      </w:pPr>
+    </w:p>
+    <w:p>
+      <w:pPr>
+        <w:rPr>
+          <w:rFonts w:eastAsia="맑은 고딕"/>
+          <w:lang w:val="en-AU" w:eastAsia="ko-KR"/>
+        </w:rPr>
+      </w:pPr>
+    </w:p>
+    <w:p>
+      <w:pPr>
+        <w:rPr>
+          <w:rFonts w:eastAsia="맑은 고딕"/>
+          <w:lang w:val="en-AU" w:eastAsia="ko-KR"/>
+        </w:rPr>
+      </w:pPr>
+    </w:p>
+    <w:p>
+      <w:pPr>
+        <w:rPr>
+          <w:rFonts w:eastAsia="맑은 고딕"/>
+          <w:lang w:val="en-AU" w:eastAsia="ko-KR"/>
+        </w:rPr>
+      </w:pPr>
+    </w:p>
+    <w:p>
+      <w:pPr>
+        <w:rPr>
+          <w:rFonts w:eastAsia="맑은 고딕"/>
+          <w:lang w:val="en-AU" w:eastAsia="ko-KR"/>
+        </w:rPr>
+      </w:pPr>
+    </w:p>
+    <w:p>
+      <w:pPr>
+        <w:rPr>
+          <w:rFonts w:eastAsia="맑은 고딕"/>
+          <w:lang w:val="en-AU" w:eastAsia="ko-KR"/>
+        </w:rPr>
+      </w:pPr>
+    </w:p>
+    <w:p>
+      <w:pPr>
+        <w:pStyle w:val="Heading2"/>
+        <w:rPr>
+          <w:rFonts w:eastAsia="맑은 고딕"/>
+          <w:lang w:eastAsia="ko-KR"/>
+        </w:rPr>
+      </w:pPr>
+      <w:bookmarkStart w:id="7" w:name="_Toc235186554"/>
+      <w:r>
+        <w:t>3. Vision, Mission &amp; Purpose</w:t>
+      </w:r>
+      <w:bookmarkEnd w:id="7"/>
+    </w:p>
+    <w:p>
+      <w:pPr>
         <w:rPr>
           <w:rFonts w:eastAsia="맑은 고딕"/>
           <w:b/>
           <w:bCs/>
           <w:lang w:val="en-AU" w:eastAsia="ko-KR"/>
         </w:rPr>
-        <w:t>Vision</w:t>
-      </w:r>
-    </w:p>
-    <w:p>
-      <w:pPr>
-        <w:rPr>
-          <w:rFonts w:eastAsia="맑은 고딕"/>
-          <w:lang w:val="en-AU" w:eastAsia="ko-KR"/>
-        </w:rPr>
       </w:pPr>
       <w:r>
         <w:rPr>
@@ -1958,100 +1953,100 @@
           <w:bCs/>
           <w:lang w:val="en-AU" w:eastAsia="ko-KR"/>
         </w:rPr>
-        <w:t>To become Australia's most trusted Korean local lifestyle platform, empowering people to discover, connect, and thrive through reliable local information and innovative technology.</w:t>
-      </w:r>
-    </w:p>
-    <w:p>
-      <w:pPr>
+        <w:t>Vision</w:t>
+      </w:r>
+    </w:p>
+    <w:p>
+      <w:pPr>
+        <w:rPr>
+          <w:rFonts w:eastAsia="맑은 고딕"/>
+          <w:lang w:val="en-AU" w:eastAsia="ko-KR"/>
+        </w:rPr>
+      </w:pPr>
+      <w:r>
         <w:rPr>
           <w:rFonts w:eastAsia="맑은 고딕"/>
           <w:b/>
           <w:bCs/>
           <w:lang w:val="en-AU" w:eastAsia="ko-KR"/>
         </w:rPr>
-      </w:pPr>
-      <w:r>
+        <w:t>To become Australia's most trusted Korean local lifestyle platform, empowering people to discover, connect, and thrive through reliable local information and innovative technology.</w:t>
+      </w:r>
+    </w:p>
+    <w:p>
+      <w:pPr>
         <w:rPr>
           <w:rFonts w:eastAsia="맑은 고딕"/>
           <w:b/>
           <w:bCs/>
           <w:lang w:val="en-AU" w:eastAsia="ko-KR"/>
         </w:rPr>
-        <w:t>Explanation</w:t>
-      </w:r>
-    </w:p>
-    <w:p>
-      <w:pPr>
-        <w:rPr>
-          <w:rFonts w:eastAsia="맑은 고딕"/>
-          <w:lang w:val="en-AU" w:eastAsia="ko-KR"/>
-        </w:rPr>
-      </w:pPr>
-      <w:r>
-        <w:rPr>
-          <w:rFonts w:eastAsia="맑은 고딕"/>
-          <w:lang w:val="en-AU" w:eastAsia="ko-KR"/>
-        </w:rPr>
-        <w:t>Our vision is to build more than a community website. We aspire to create the first platform Koreans think of whenever they need trusted information, local services, businesses, or community resources in Australia.</w:t>
-      </w:r>
-    </w:p>
-    <w:p>
-      <w:pPr>
-        <w:rPr>
-          <w:rFonts w:eastAsia="맑은 고딕"/>
-          <w:lang w:val="en-AU" w:eastAsia="ko-KR"/>
-        </w:rPr>
-      </w:pPr>
-      <w:r>
-        <w:rPr>
-          <w:rFonts w:eastAsia="맑은 고딕"/>
-          <w:lang w:val="en-AU" w:eastAsia="ko-KR"/>
-        </w:rPr>
-        <w:t>Starting with Adelaide, we aim to expand across Australian cities while becoming the leading digital ecosystem connecting Korean communities with local opportunities.</w:t>
-      </w:r>
-    </w:p>
-    <w:p>
-      <w:pPr>
-        <w:rPr>
-          <w:rFonts w:eastAsia="맑은 고딕"/>
-          <w:lang w:val="en-AU" w:eastAsia="ko-KR"/>
-        </w:rPr>
-      </w:pPr>
-      <w:r>
-        <w:rPr>
-          <w:rFonts w:eastAsia="맑은 고딕"/>
-          <w:lang w:val="en-AU" w:eastAsia="ko-KR"/>
-        </w:rPr>
-        <w:pict w14:anchorId="0C5C2656">
-          <v:rect id="_x0000_i2169" style="width:0;height:1.5pt" o:hralign="center" o:hrstd="t" o:hr="t" fillcolor="#a0a0a0" stroked="f"/>
-        </w:pict>
-      </w:r>
-    </w:p>
-    <w:p>
-      <w:pPr>
+      </w:pPr>
+      <w:r>
         <w:rPr>
           <w:rFonts w:eastAsia="맑은 고딕"/>
           <w:b/>
           <w:bCs/>
           <w:lang w:val="en-AU" w:eastAsia="ko-KR"/>
         </w:rPr>
-      </w:pPr>
-      <w:r>
+        <w:t>Explanation</w:t>
+      </w:r>
+    </w:p>
+    <w:p>
+      <w:pPr>
+        <w:rPr>
+          <w:rFonts w:eastAsia="맑은 고딕"/>
+          <w:lang w:val="en-AU" w:eastAsia="ko-KR"/>
+        </w:rPr>
+      </w:pPr>
+      <w:r>
+        <w:rPr>
+          <w:rFonts w:eastAsia="맑은 고딕"/>
+          <w:lang w:val="en-AU" w:eastAsia="ko-KR"/>
+        </w:rPr>
+        <w:t>Our vision is to build more than a community website. We aspire to create the first platform Koreans think of whenever they need trusted information, local services, businesses, or community resources in Australia.</w:t>
+      </w:r>
+    </w:p>
+    <w:p>
+      <w:pPr>
+        <w:rPr>
+          <w:rFonts w:eastAsia="맑은 고딕"/>
+          <w:lang w:val="en-AU" w:eastAsia="ko-KR"/>
+        </w:rPr>
+      </w:pPr>
+      <w:r>
+        <w:rPr>
+          <w:rFonts w:eastAsia="맑은 고딕"/>
+          <w:lang w:val="en-AU" w:eastAsia="ko-KR"/>
+        </w:rPr>
+        <w:t>Starting with Adelaide, we aim to expand across Australian cities while becoming the leading digital ecosystem connecting Korean communities with local opportunities.</w:t>
+      </w:r>
+    </w:p>
+    <w:p>
+      <w:pPr>
+        <w:rPr>
+          <w:rFonts w:eastAsia="맑은 고딕"/>
+          <w:lang w:val="en-AU" w:eastAsia="ko-KR"/>
+        </w:rPr>
+      </w:pPr>
+      <w:r>
+        <w:rPr>
+          <w:rFonts w:eastAsia="맑은 고딕"/>
+          <w:lang w:val="en-AU" w:eastAsia="ko-KR"/>
+        </w:rPr>
+        <w:pict w14:anchorId="0C5C2656">
+          <v:rect id="_x0000_i1032" style="width:0;height:1.5pt" o:hralign="center" o:hrstd="t" o:hr="t" fillcolor="#a0a0a0" stroked="f"/>
+        </w:pict>
+      </w:r>
+    </w:p>
+    <w:p>
+      <w:pPr>
         <w:rPr>
           <w:rFonts w:eastAsia="맑은 고딕"/>
           <w:b/>
           <w:bCs/>
           <w:lang w:val="en-AU" w:eastAsia="ko-KR"/>
         </w:rPr>
-        <w:t>Mission</w:t>
-      </w:r>
-    </w:p>
-    <w:p>
-      <w:pPr>
-        <w:rPr>
-          <w:rFonts w:eastAsia="맑은 고딕"/>
-          <w:lang w:val="en-AU" w:eastAsia="ko-KR"/>
-        </w:rPr>
       </w:pPr>
       <w:r>
         <w:rPr>
@@ -2060,100 +2055,100 @@
           <w:bCs/>
           <w:lang w:val="en-AU" w:eastAsia="ko-KR"/>
         </w:rPr>
-        <w:t>We simplify everyday life by providing trusted local information, verified business directories, practical community resources, and AI-powered tools through a modern, user-friendly platform.</w:t>
-      </w:r>
-    </w:p>
-    <w:p>
-      <w:pPr>
+        <w:t>Mission</w:t>
+      </w:r>
+    </w:p>
+    <w:p>
+      <w:pPr>
+        <w:rPr>
+          <w:rFonts w:eastAsia="맑은 고딕"/>
+          <w:lang w:val="en-AU" w:eastAsia="ko-KR"/>
+        </w:rPr>
+      </w:pPr>
+      <w:r>
         <w:rPr>
           <w:rFonts w:eastAsia="맑은 고딕"/>
           <w:b/>
           <w:bCs/>
           <w:lang w:val="en-AU" w:eastAsia="ko-KR"/>
         </w:rPr>
-      </w:pPr>
-      <w:r>
+        <w:t>We simplify everyday life by providing trusted local information, verified business directories, practical community resources, and AI-powered tools through a modern, user-friendly platform.</w:t>
+      </w:r>
+    </w:p>
+    <w:p>
+      <w:pPr>
         <w:rPr>
           <w:rFonts w:eastAsia="맑은 고딕"/>
           <w:b/>
           <w:bCs/>
           <w:lang w:val="en-AU" w:eastAsia="ko-KR"/>
         </w:rPr>
-        <w:t>Explanation</w:t>
-      </w:r>
-    </w:p>
-    <w:p>
-      <w:pPr>
-        <w:rPr>
-          <w:rFonts w:eastAsia="맑은 고딕"/>
-          <w:lang w:val="en-AU" w:eastAsia="ko-KR"/>
-        </w:rPr>
-      </w:pPr>
-      <w:r>
-        <w:rPr>
-          <w:rFonts w:eastAsia="맑은 고딕"/>
-          <w:lang w:val="en-AU" w:eastAsia="ko-KR"/>
-        </w:rPr>
-        <w:t>Our mission is to organize fragmented local information into one reliable destination where users can quickly discover what they need without searching through multiple websites, forums, and social media groups.</w:t>
-      </w:r>
-    </w:p>
-    <w:p>
-      <w:pPr>
-        <w:rPr>
-          <w:rFonts w:eastAsia="맑은 고딕"/>
-          <w:lang w:val="en-AU" w:eastAsia="ko-KR"/>
-        </w:rPr>
-      </w:pPr>
-      <w:r>
-        <w:rPr>
-          <w:rFonts w:eastAsia="맑은 고딕"/>
-          <w:lang w:val="en-AU" w:eastAsia="ko-KR"/>
-        </w:rPr>
-        <w:t>By combining technology, structured data, and local expertise, we help people make informed decisions with confidence.</w:t>
-      </w:r>
-    </w:p>
-    <w:p>
-      <w:pPr>
-        <w:rPr>
-          <w:rFonts w:eastAsia="맑은 고딕"/>
-          <w:lang w:val="en-AU" w:eastAsia="ko-KR"/>
-        </w:rPr>
-      </w:pPr>
-      <w:r>
-        <w:rPr>
-          <w:rFonts w:eastAsia="맑은 고딕"/>
-          <w:lang w:val="en-AU" w:eastAsia="ko-KR"/>
-        </w:rPr>
-        <w:pict w14:anchorId="46376086">
-          <v:rect id="_x0000_i2170" style="width:0;height:1.5pt" o:hralign="center" o:hrstd="t" o:hr="t" fillcolor="#a0a0a0" stroked="f"/>
-        </w:pict>
-      </w:r>
-    </w:p>
-    <w:p>
-      <w:pPr>
+      </w:pPr>
+      <w:r>
         <w:rPr>
           <w:rFonts w:eastAsia="맑은 고딕"/>
           <w:b/>
           <w:bCs/>
           <w:lang w:val="en-AU" w:eastAsia="ko-KR"/>
         </w:rPr>
-      </w:pPr>
-      <w:r>
+        <w:t>Explanation</w:t>
+      </w:r>
+    </w:p>
+    <w:p>
+      <w:pPr>
+        <w:rPr>
+          <w:rFonts w:eastAsia="맑은 고딕"/>
+          <w:lang w:val="en-AU" w:eastAsia="ko-KR"/>
+        </w:rPr>
+      </w:pPr>
+      <w:r>
+        <w:rPr>
+          <w:rFonts w:eastAsia="맑은 고딕"/>
+          <w:lang w:val="en-AU" w:eastAsia="ko-KR"/>
+        </w:rPr>
+        <w:t>Our mission is to organize fragmented local information into one reliable destination where users can quickly discover what they need without searching through multiple websites, forums, and social media groups.</w:t>
+      </w:r>
+    </w:p>
+    <w:p>
+      <w:pPr>
+        <w:rPr>
+          <w:rFonts w:eastAsia="맑은 고딕"/>
+          <w:lang w:val="en-AU" w:eastAsia="ko-KR"/>
+        </w:rPr>
+      </w:pPr>
+      <w:r>
+        <w:rPr>
+          <w:rFonts w:eastAsia="맑은 고딕"/>
+          <w:lang w:val="en-AU" w:eastAsia="ko-KR"/>
+        </w:rPr>
+        <w:t>By combining technology, structured data, and local expertise, we help people make informed decisions with confidence.</w:t>
+      </w:r>
+    </w:p>
+    <w:p>
+      <w:pPr>
+        <w:rPr>
+          <w:rFonts w:eastAsia="맑은 고딕"/>
+          <w:lang w:val="en-AU" w:eastAsia="ko-KR"/>
+        </w:rPr>
+      </w:pPr>
+      <w:r>
+        <w:rPr>
+          <w:rFonts w:eastAsia="맑은 고딕"/>
+          <w:lang w:val="en-AU" w:eastAsia="ko-KR"/>
+        </w:rPr>
+        <w:pict w14:anchorId="46376086">
+          <v:rect id="_x0000_i1033" style="width:0;height:1.5pt" o:hralign="center" o:hrstd="t" o:hr="t" fillcolor="#a0a0a0" stroked="f"/>
+        </w:pict>
+      </w:r>
+    </w:p>
+    <w:p>
+      <w:pPr>
         <w:rPr>
           <w:rFonts w:eastAsia="맑은 고딕"/>
           <w:b/>
           <w:bCs/>
           <w:lang w:val="en-AU" w:eastAsia="ko-KR"/>
         </w:rPr>
-        <w:t>Purpose</w:t>
-      </w:r>
-    </w:p>
-    <w:p>
-      <w:pPr>
-        <w:rPr>
-          <w:rFonts w:eastAsia="맑은 고딕"/>
-          <w:lang w:val="en-AU" w:eastAsia="ko-KR"/>
-        </w:rPr>
       </w:pPr>
       <w:r>
         <w:rPr>
@@ -2162,92 +2157,109 @@
           <w:bCs/>
           <w:lang w:val="en-AU" w:eastAsia="ko-KR"/>
         </w:rPr>
-        <w:t>We believe everyone deserves easy access to trustworthy local information, regardless of language barriers or where they are starting their journey.</w:t>
-      </w:r>
-    </w:p>
-    <w:p>
-      <w:pPr>
+        <w:t>Purpose</w:t>
+      </w:r>
+    </w:p>
+    <w:p>
+      <w:pPr>
+        <w:rPr>
+          <w:rFonts w:eastAsia="맑은 고딕"/>
+          <w:lang w:val="en-AU" w:eastAsia="ko-KR"/>
+        </w:rPr>
+      </w:pPr>
+      <w:r>
         <w:rPr>
           <w:rFonts w:eastAsia="맑은 고딕"/>
           <w:b/>
           <w:bCs/>
           <w:lang w:val="en-AU" w:eastAsia="ko-KR"/>
         </w:rPr>
-      </w:pPr>
-      <w:r>
+        <w:t>We believe everyone deserves easy access to trustworthy local information, regardless of language barriers or where they are starting their journey.</w:t>
+      </w:r>
+    </w:p>
+    <w:p>
+      <w:pPr>
         <w:rPr>
           <w:rFonts w:eastAsia="맑은 고딕"/>
           <w:b/>
           <w:bCs/>
           <w:lang w:val="en-AU" w:eastAsia="ko-KR"/>
         </w:rPr>
-        <w:t>Explanation</w:t>
-      </w:r>
-    </w:p>
-    <w:p>
-      <w:pPr>
-        <w:rPr>
-          <w:rFonts w:eastAsia="맑은 고딕"/>
-          <w:lang w:val="en-AU" w:eastAsia="ko-KR"/>
-        </w:rPr>
-      </w:pPr>
-      <w:r>
-        <w:rPr>
-          <w:rFonts w:eastAsia="맑은 고딕"/>
-          <w:lang w:val="en-AU" w:eastAsia="ko-KR"/>
-        </w:rPr>
-        <w:t>Moving to a new city or country often means navigating unfamiliar systems, languages, and communities.</w:t>
-      </w:r>
-    </w:p>
-    <w:p>
-      <w:pPr>
-        <w:rPr>
-          <w:rFonts w:eastAsia="맑은 고딕"/>
-          <w:lang w:val="en-AU" w:eastAsia="ko-KR"/>
-        </w:rPr>
-      </w:pPr>
-      <w:r>
-        <w:rPr>
-          <w:rFonts w:eastAsia="맑은 고딕"/>
-          <w:lang w:val="en-AU" w:eastAsia="ko-KR"/>
-        </w:rPr>
-        <w:t>Our purpose is to remove these barriers by making local knowledge more accessible, understandable, and trustworthy, helping people feel more connected, confident, and supported in their everyday lives.</w:t>
-      </w:r>
-    </w:p>
-    <w:p>
-      <w:pPr>
-        <w:pStyle w:val="Heading2"/>
-        <w:rPr>
-          <w:rFonts w:eastAsia="맑은 고딕"/>
-          <w:lang w:eastAsia="ko-KR"/>
-        </w:rPr>
-      </w:pPr>
-      <w:bookmarkStart w:id="8" w:name="_Toc235186555"/>
-      <w:r>
-        <w:lastRenderedPageBreak/>
-        <w:t>4. Target Audience (High Level)</w:t>
-      </w:r>
-      <w:bookmarkEnd w:id="8"/>
-      <w:r>
-        <w:br/>
-      </w:r>
-    </w:p>
-    <w:p>
-      <w:pPr>
+      </w:pPr>
+      <w:r>
         <w:rPr>
           <w:rFonts w:eastAsia="맑은 고딕"/>
           <w:b/>
           <w:bCs/>
           <w:lang w:val="en-AU" w:eastAsia="ko-KR"/>
         </w:rPr>
-      </w:pPr>
-      <w:r>
+        <w:t>Explanation</w:t>
+      </w:r>
+    </w:p>
+    <w:p>
+      <w:pPr>
+        <w:rPr>
+          <w:rFonts w:eastAsia="맑은 고딕"/>
+          <w:lang w:val="en-AU" w:eastAsia="ko-KR"/>
+        </w:rPr>
+      </w:pPr>
+      <w:r>
+        <w:rPr>
+          <w:rFonts w:eastAsia="맑은 고딕"/>
+          <w:lang w:val="en-AU" w:eastAsia="ko-KR"/>
+        </w:rPr>
+        <w:t>Moving to a new city or country often means navigating unfamiliar systems, languages, and communities.</w:t>
+      </w:r>
+    </w:p>
+    <w:p>
+      <w:pPr>
+        <w:rPr>
+          <w:rFonts w:eastAsia="맑은 고딕"/>
+          <w:lang w:val="en-AU" w:eastAsia="ko-KR"/>
+        </w:rPr>
+      </w:pPr>
+      <w:r>
+        <w:rPr>
+          <w:rFonts w:eastAsia="맑은 고딕"/>
+          <w:lang w:val="en-AU" w:eastAsia="ko-KR"/>
+        </w:rPr>
+        <w:lastRenderedPageBreak/>
+        <w:t>Our purpose is to remove these barriers by making local knowledge more accessible, understandable, and trustworthy, helping people feel more connected, confident, and supported in their everyday lives.</w:t>
+      </w:r>
+    </w:p>
+    <w:p>
+      <w:pPr>
+        <w:pStyle w:val="Heading2"/>
+        <w:rPr>
+          <w:rFonts w:eastAsia="맑은 고딕"/>
+          <w:lang w:eastAsia="ko-KR"/>
+        </w:rPr>
+      </w:pPr>
+      <w:bookmarkStart w:id="8" w:name="_Toc235186555"/>
+      <w:r>
+        <w:t>4. Target Audience (High Level)</w:t>
+      </w:r>
+      <w:bookmarkEnd w:id="8"/>
+      <w:r>
+        <w:br/>
+      </w:r>
+    </w:p>
+    <w:p>
+      <w:pPr>
         <w:rPr>
           <w:rFonts w:eastAsia="맑은 고딕"/>
           <w:b/>
           <w:bCs/>
           <w:lang w:val="en-AU" w:eastAsia="ko-KR"/>
         </w:rPr>
+      </w:pPr>
+      <w:r>
+        <w:rPr>
+          <w:rFonts w:eastAsia="맑은 고딕"/>
+          <w:b/>
+          <w:bCs/>
+          <w:lang w:val="en-AU" w:eastAsia="ko-KR"/>
+        </w:rPr>
         <w:t>Primary Audience</w:t>
       </w:r>
     </w:p>
@@ -2294,7 +2306,7 @@
           <w:lang w:val="en-AU" w:eastAsia="ko-KR"/>
         </w:rPr>
         <w:pict w14:anchorId="3934F5E1">
-          <v:rect id="_x0000_i2171" style="width:0;height:1.5pt" o:hralign="center" o:hrstd="t" o:hr="t" fillcolor="#a0a0a0" stroked="f"/>
+          <v:rect id="_x0000_i1034" style="width:0;height:1.5pt" o:hralign="center" o:hrstd="t" o:hr="t" fillcolor="#a0a0a0" stroked="f"/>
         </w:pict>
       </w:r>
     </w:p>
@@ -2436,7 +2448,7 @@
           <w:lang w:val="en-AU" w:eastAsia="ko-KR"/>
         </w:rPr>
         <w:pict w14:anchorId="3FC98E15">
-          <v:rect id="_x0000_i2172" style="width:0;height:1.5pt" o:hralign="center" o:hrstd="t" o:hr="t" fillcolor="#a0a0a0" stroked="f"/>
+          <v:rect id="_x0000_i1035" style="width:0;height:1.5pt" o:hralign="center" o:hrstd="t" o:hr="t" fillcolor="#a0a0a0" stroked="f"/>
         </w:pict>
       </w:r>
     </w:p>
@@ -2528,6 +2540,7 @@
           <w:rFonts w:eastAsia="맑은 고딕"/>
           <w:lang w:val="en-AU" w:eastAsia="ko-KR"/>
         </w:rPr>
+        <w:lastRenderedPageBreak/>
         <w:t xml:space="preserve">Tourists visiting Adelaide who are looking for Korean-related services and recommendations </w:t>
       </w:r>
     </w:p>
@@ -2558,9 +2571,8 @@
           <w:rFonts w:eastAsia="맑은 고딕"/>
           <w:lang w:val="en-AU" w:eastAsia="ko-KR"/>
         </w:rPr>
-        <w:lastRenderedPageBreak/>
         <w:pict w14:anchorId="325C9133">
-          <v:rect id="_x0000_i2173" style="width:0;height:1.5pt" o:hralign="center" o:hrstd="t" o:hr="t" fillcolor="#a0a0a0" stroked="f"/>
+          <v:rect id="_x0000_i1036" style="width:0;height:1.5pt" o:hralign="center" o:hrstd="t" o:hr="t" fillcolor="#a0a0a0" stroked="f"/>
         </w:pict>
       </w:r>
     </w:p>
@@ -2769,7 +2781,7 @@
     <w:p>
       <w:pPr>
         <w:rPr>
-          <w:rFonts w:eastAsia="맑은 고딕" w:hint="eastAsia"/>
+          <w:rFonts w:eastAsia="맑은 고딕"/>
           <w:lang w:val="en-AU" w:eastAsia="ko-KR"/>
         </w:rPr>
       </w:pPr>
@@ -2784,7 +2796,6 @@
       </w:pPr>
       <w:bookmarkStart w:id="9" w:name="_Toc235186556"/>
       <w:r>
-        <w:lastRenderedPageBreak/>
         <w:t>5. Brand Positioning</w:t>
       </w:r>
       <w:bookmarkEnd w:id="9"/>
@@ -2825,59 +2836,44 @@
           <w:bCs/>
           <w:lang w:val="en-AU" w:eastAsia="ko-KR"/>
         </w:rPr>
-        <w:t>[Project Name] is the trusted Korean local lifestyle platform for people living in Adelaide, providing verified local information, curated business directories, and practical community resources through a modern, AI-powered digital experience.</w:t>
-      </w:r>
-    </w:p>
-    <w:p>
-      <w:pPr>
-        <w:rPr>
-          <w:rFonts w:eastAsia="맑은 고딕"/>
-          <w:lang w:val="en-AU" w:eastAsia="ko-KR"/>
-        </w:rPr>
-      </w:pPr>
-      <w:r>
-        <w:rPr>
-          <w:rFonts w:eastAsia="맑은 고딕"/>
-          <w:lang w:val="en-AU" w:eastAsia="ko-KR"/>
-        </w:rPr>
-        <w:pict w14:anchorId="713391A3">
-          <v:rect id="_x0000_i2174" style="width:0;height:1.5pt" o:hralign="center" o:hrstd="t" o:hr="t" fillcolor="#a0a0a0" stroked="f"/>
-        </w:pict>
-      </w:r>
-    </w:p>
-    <w:p>
-      <w:pPr>
+        <w:t>Discover Adelaide Korea</w:t>
+      </w:r>
+      <w:r>
         <w:rPr>
           <w:rFonts w:eastAsia="맑은 고딕"/>
           <w:b/>
           <w:bCs/>
           <w:lang w:val="en-AU" w:eastAsia="ko-KR"/>
         </w:rPr>
-      </w:pPr>
-      <w:r>
+        <w:t xml:space="preserve"> is the trusted Korean local lifestyle platform for people living in Adelaide, providing verified local information, curated business directories, and practical community resources through a modern, AI-powered digital experience.</w:t>
+      </w:r>
+    </w:p>
+    <w:p>
+      <w:pPr>
+        <w:rPr>
+          <w:rFonts w:eastAsia="맑은 고딕"/>
+          <w:lang w:val="en-AU" w:eastAsia="ko-KR"/>
+        </w:rPr>
+      </w:pPr>
+      <w:r>
+        <w:rPr>
+          <w:rFonts w:eastAsia="맑은 고딕"/>
+          <w:lang w:val="en-AU" w:eastAsia="ko-KR"/>
+        </w:rPr>
+        <w:pict w14:anchorId="713391A3">
+          <v:rect id="_x0000_i1037" style="width:0;height:1.5pt" o:hralign="center" o:hrstd="t" o:hr="t" fillcolor="#a0a0a0" stroked="f"/>
+        </w:pict>
+      </w:r>
+    </w:p>
+    <w:p>
+      <w:pPr>
         <w:rPr>
           <w:rFonts w:eastAsia="맑은 고딕"/>
           <w:b/>
           <w:bCs/>
           <w:lang w:val="en-AU" w:eastAsia="ko-KR"/>
         </w:rPr>
-        <w:t>Positioning Explanation</w:t>
-      </w:r>
-    </w:p>
-    <w:p>
-      <w:pPr>
-        <w:rPr>
-          <w:rFonts w:eastAsia="맑은 고딕"/>
-          <w:lang w:val="en-AU" w:eastAsia="ko-KR"/>
-        </w:rPr>
-      </w:pPr>
-      <w:r>
-        <w:rPr>
-          <w:rFonts w:eastAsia="맑은 고딕"/>
-          <w:lang w:val="en-AU" w:eastAsia="ko-KR"/>
-        </w:rPr>
-        <w:t xml:space="preserve">Unlike traditional community forums that primarily depend on user-generated posts, </w:t>
-      </w:r>
+      </w:pPr>
       <w:r>
         <w:rPr>
           <w:rFonts w:eastAsia="맑은 고딕"/>
@@ -2885,79 +2881,103 @@
           <w:bCs/>
           <w:lang w:val="en-AU" w:eastAsia="ko-KR"/>
         </w:rPr>
-        <w:t>[Project Name]</w:t>
-      </w:r>
-      <w:r>
-        <w:rPr>
-          <w:rFonts w:eastAsia="맑은 고딕"/>
-          <w:lang w:val="en-AU" w:eastAsia="ko-KR"/>
-        </w:rPr>
-        <w:t xml:space="preserve"> organizes local information into structured, searchable, and reliable content.</w:t>
-      </w:r>
-    </w:p>
-    <w:p>
-      <w:pPr>
-        <w:rPr>
-          <w:rFonts w:eastAsia="맑은 고딕"/>
-          <w:lang w:val="en-AU" w:eastAsia="ko-KR"/>
-        </w:rPr>
-      </w:pPr>
-      <w:r>
-        <w:rPr>
-          <w:rFonts w:eastAsia="맑은 고딕"/>
-          <w:lang w:val="en-AU" w:eastAsia="ko-KR"/>
-        </w:rPr>
-        <w:t>The platform is designed to help users spend less time searching and more time making informed decisions by combining verified information, intuitive navigation, interactive maps, and modern technology.</w:t>
-      </w:r>
-    </w:p>
-    <w:p>
-      <w:pPr>
-        <w:rPr>
-          <w:rFonts w:eastAsia="맑은 고딕"/>
-          <w:lang w:val="en-AU" w:eastAsia="ko-KR"/>
-        </w:rPr>
-      </w:pPr>
-      <w:r>
-        <w:rPr>
-          <w:rFonts w:eastAsia="맑은 고딕"/>
-          <w:lang w:val="en-AU" w:eastAsia="ko-KR"/>
-        </w:rPr>
-        <w:t>Rather than simply hosting discussions, the platform focuses on delivering practical value through trusted local knowledge.</w:t>
-      </w:r>
-    </w:p>
-    <w:p>
-      <w:pPr>
-        <w:rPr>
-          <w:rFonts w:eastAsia="맑은 고딕"/>
-          <w:lang w:val="en-AU" w:eastAsia="ko-KR"/>
-        </w:rPr>
-      </w:pPr>
-      <w:r>
-        <w:rPr>
-          <w:rFonts w:eastAsia="맑은 고딕"/>
-          <w:lang w:val="en-AU" w:eastAsia="ko-KR"/>
-        </w:rPr>
-        <w:pict w14:anchorId="62670AAF">
-          <v:rect id="_x0000_i2175" style="width:0;height:1.5pt" o:hralign="center" o:hrstd="t" o:hr="t" fillcolor="#a0a0a0" stroked="f"/>
-        </w:pict>
-      </w:r>
-    </w:p>
-    <w:p>
-      <w:pPr>
+        <w:t>Positioning Explanation</w:t>
+      </w:r>
+    </w:p>
+    <w:p>
+      <w:pPr>
+        <w:rPr>
+          <w:rFonts w:eastAsia="맑은 고딕"/>
+          <w:lang w:val="en-AU" w:eastAsia="ko-KR"/>
+        </w:rPr>
+      </w:pPr>
+      <w:r>
+        <w:rPr>
+          <w:rFonts w:eastAsia="맑은 고딕"/>
+          <w:lang w:val="en-AU" w:eastAsia="ko-KR"/>
+        </w:rPr>
+        <w:t xml:space="preserve">Unlike traditional community forums that primarily depend on user-generated posts, </w:t>
+      </w:r>
+      <w:r>
         <w:rPr>
           <w:rFonts w:eastAsia="맑은 고딕"/>
           <w:b/>
           <w:bCs/>
           <w:lang w:val="en-AU" w:eastAsia="ko-KR"/>
         </w:rPr>
-      </w:pPr>
-      <w:r>
+        <w:t>Discover Adelaide Korea</w:t>
+      </w:r>
+      <w:r>
+        <w:rPr>
+          <w:rFonts w:eastAsia="맑은 고딕"/>
+          <w:lang w:val="en-AU" w:eastAsia="ko-KR"/>
+        </w:rPr>
+        <w:t xml:space="preserve"> organizes local information into structured, searchable, and reliable content.</w:t>
+      </w:r>
+    </w:p>
+    <w:p>
+      <w:pPr>
+        <w:rPr>
+          <w:rFonts w:eastAsia="맑은 고딕"/>
+          <w:lang w:val="en-AU" w:eastAsia="ko-KR"/>
+        </w:rPr>
+      </w:pPr>
+      <w:r>
+        <w:rPr>
+          <w:rFonts w:eastAsia="맑은 고딕"/>
+          <w:lang w:val="en-AU" w:eastAsia="ko-KR"/>
+        </w:rPr>
+        <w:t>The platform is designed to help users spend less time searching and more time making informed decisions by combining verified information, intuitive navigation, interactive maps, and modern technology.</w:t>
+      </w:r>
+    </w:p>
+    <w:p>
+      <w:pPr>
+        <w:rPr>
+          <w:rFonts w:eastAsia="맑은 고딕"/>
+          <w:lang w:val="en-AU" w:eastAsia="ko-KR"/>
+        </w:rPr>
+      </w:pPr>
+      <w:r>
+        <w:rPr>
+          <w:rFonts w:eastAsia="맑은 고딕"/>
+          <w:lang w:val="en-AU" w:eastAsia="ko-KR"/>
+        </w:rPr>
+        <w:t>Rather than simply hosting discussions, the platform focuses on delivering practical value through trusted local knowledge.</w:t>
+      </w:r>
+    </w:p>
+    <w:p>
+      <w:pPr>
+        <w:rPr>
+          <w:rFonts w:eastAsia="맑은 고딕"/>
+          <w:lang w:val="en-AU" w:eastAsia="ko-KR"/>
+        </w:rPr>
+      </w:pPr>
+      <w:r>
+        <w:rPr>
+          <w:rFonts w:eastAsia="맑은 고딕"/>
+          <w:lang w:val="en-AU" w:eastAsia="ko-KR"/>
+        </w:rPr>
+        <w:pict w14:anchorId="62670AAF">
+          <v:rect id="_x0000_i1038" style="width:0;height:1.5pt" o:hralign="center" o:hrstd="t" o:hr="t" fillcolor="#a0a0a0" stroked="f"/>
+        </w:pict>
+      </w:r>
+    </w:p>
+    <w:p>
+      <w:pPr>
         <w:rPr>
           <w:rFonts w:eastAsia="맑은 고딕"/>
           <w:b/>
           <w:bCs/>
           <w:lang w:val="en-AU" w:eastAsia="ko-KR"/>
         </w:rPr>
+      </w:pPr>
+      <w:r>
+        <w:rPr>
+          <w:rFonts w:eastAsia="맑은 고딕"/>
+          <w:b/>
+          <w:bCs/>
+          <w:lang w:val="en-AU" w:eastAsia="ko-KR"/>
+        </w:rPr>
         <w:t>Unique Value Proposition (UVP)</w:t>
       </w:r>
     </w:p>
@@ -2989,7 +3009,7 @@
           <w:lang w:val="en-AU" w:eastAsia="ko-KR"/>
         </w:rPr>
         <w:pict w14:anchorId="2611BEB5">
-          <v:rect id="_x0000_i2176" style="width:0;height:1.5pt" o:hralign="center" o:hrstd="t" o:hr="t" fillcolor="#a0a0a0" stroked="f"/>
+          <v:rect id="_x0000_i1039" style="width:0;height:1.5pt" o:hralign="center" o:hrstd="t" o:hr="t" fillcolor="#a0a0a0" stroked="f"/>
         </w:pict>
       </w:r>
     </w:p>
@@ -3100,6 +3120,7 @@
           <w:rFonts w:eastAsia="맑은 고딕"/>
           <w:lang w:val="en-AU" w:eastAsia="ko-KR"/>
         </w:rPr>
+        <w:lastRenderedPageBreak/>
         <w:t xml:space="preserve">Continuously Updated </w:t>
       </w:r>
     </w:p>
@@ -3149,9 +3170,8 @@
           <w:rFonts w:eastAsia="맑은 고딕"/>
           <w:lang w:val="en-AU" w:eastAsia="ko-KR"/>
         </w:rPr>
-        <w:lastRenderedPageBreak/>
         <w:pict w14:anchorId="11CDE525">
-          <v:rect id="_x0000_i2177" style="width:0;height:1.5pt" o:hralign="center" o:hrstd="t" o:hr="t" fillcolor="#a0a0a0" stroked="f"/>
+          <v:rect id="_x0000_i1040" style="width:0;height:1.5pt" o:hralign="center" o:hrstd="t" o:hr="t" fillcolor="#a0a0a0" stroked="f"/>
         </w:pict>
       </w:r>
     </w:p>
@@ -3249,7 +3269,7 @@
                 <w:bCs/>
                 <w:lang w:val="en-AU" w:eastAsia="ko-KR"/>
               </w:rPr>
-              <w:t>[Project Name]</w:t>
+              <w:t>Discover Adelaide Korea</w:t>
             </w:r>
           </w:p>
         </w:tc>
@@ -3513,7 +3533,7 @@
           <w:lang w:val="en-AU" w:eastAsia="ko-KR"/>
         </w:rPr>
         <w:pict w14:anchorId="22DC898B">
-          <v:rect id="_x0000_i2178" style="width:0;height:1.5pt" o:hralign="center" o:hrstd="t" o:hr="t" fillcolor="#a0a0a0" stroked="f"/>
+          <v:rect id="_x0000_i1041" style="width:0;height:1.5pt" o:hralign="center" o:hrstd="t" o:hr="t" fillcolor="#a0a0a0" stroked="f"/>
         </w:pict>
       </w:r>
     </w:p>
@@ -3722,7 +3742,7 @@
     <w:p>
       <w:pPr>
         <w:rPr>
-          <w:rFonts w:eastAsia="맑은 고딕" w:hint="eastAsia"/>
+          <w:rFonts w:eastAsia="맑은 고딕"/>
           <w:lang w:val="en-AU" w:eastAsia="ko-KR"/>
         </w:rPr>
       </w:pPr>
@@ -3737,7 +3757,6 @@
       </w:pPr>
       <w:bookmarkStart w:id="10" w:name="_Toc235186557"/>
       <w:r>
-        <w:lastRenderedPageBreak/>
         <w:t>6. Brand Personality</w:t>
       </w:r>
       <w:bookmarkEnd w:id="10"/>
@@ -3782,7 +3801,7 @@
           <w:bCs/>
           <w:lang w:val="en-AU" w:eastAsia="ko-KR"/>
         </w:rPr>
-        <w:t>[Project Name]</w:t>
+        <w:t>Discover Adelaide Korea</w:t>
       </w:r>
       <w:r>
         <w:rPr>
@@ -3945,7 +3964,7 @@
           <w:lang w:val="en-AU" w:eastAsia="ko-KR"/>
         </w:rPr>
         <w:pict w14:anchorId="56CBF61A">
-          <v:rect id="_x0000_i2179" style="width:0;height:1.5pt" o:hralign="center" o:hrstd="t" o:hr="t" fillcolor="#a0a0a0" stroked="f"/>
+          <v:rect id="_x0000_i1042" style="width:0;height:1.5pt" o:hralign="center" o:hrstd="t" o:hr="t" fillcolor="#a0a0a0" stroked="f"/>
         </w:pict>
       </w:r>
     </w:p>
@@ -4015,7 +4034,7 @@
           <w:lang w:val="en-AU" w:eastAsia="ko-KR"/>
         </w:rPr>
         <w:pict w14:anchorId="69AD2201">
-          <v:rect id="_x0000_i2180" style="width:0;height:1.5pt" o:hralign="center" o:hrstd="t" o:hr="t" fillcolor="#a0a0a0" stroked="f"/>
+          <v:rect id="_x0000_i1043" style="width:0;height:1.5pt" o:hralign="center" o:hrstd="t" o:hr="t" fillcolor="#a0a0a0" stroked="f"/>
         </w:pict>
       </w:r>
     </w:p>
@@ -4066,7 +4085,7 @@
           <w:lang w:val="en-AU" w:eastAsia="ko-KR"/>
         </w:rPr>
         <w:pict w14:anchorId="31FE630C">
-          <v:rect id="_x0000_i2181" style="width:0;height:1.5pt" o:hralign="center" o:hrstd="t" o:hr="t" fillcolor="#a0a0a0" stroked="f"/>
+          <v:rect id="_x0000_i1044" style="width:0;height:1.5pt" o:hralign="center" o:hrstd="t" o:hr="t" fillcolor="#a0a0a0" stroked="f"/>
         </w:pict>
       </w:r>
     </w:p>
@@ -4117,7 +4136,7 @@
           <w:lang w:val="en-AU" w:eastAsia="ko-KR"/>
         </w:rPr>
         <w:pict w14:anchorId="072A7F4E">
-          <v:rect id="_x0000_i2182" style="width:0;height:1.5pt" o:hralign="center" o:hrstd="t" o:hr="t" fillcolor="#a0a0a0" stroked="f"/>
+          <v:rect id="_x0000_i1045" style="width:0;height:1.5pt" o:hralign="center" o:hrstd="t" o:hr="t" fillcolor="#a0a0a0" stroked="f"/>
         </w:pict>
       </w:r>
     </w:p>
@@ -4168,7 +4187,7 @@
           <w:lang w:val="en-AU" w:eastAsia="ko-KR"/>
         </w:rPr>
         <w:pict w14:anchorId="046292CE">
-          <v:rect id="_x0000_i2183" style="width:0;height:1.5pt" o:hralign="center" o:hrstd="t" o:hr="t" fillcolor="#a0a0a0" stroked="f"/>
+          <v:rect id="_x0000_i1046" style="width:0;height:1.5pt" o:hralign="center" o:hrstd="t" o:hr="t" fillcolor="#a0a0a0" stroked="f"/>
         </w:pict>
       </w:r>
     </w:p>
@@ -4188,6 +4207,7 @@
           <w:bCs/>
           <w:lang w:val="en-AU" w:eastAsia="ko-KR"/>
         </w:rPr>
+        <w:lastRenderedPageBreak/>
         <w:t>Continuous Improvement</w:t>
       </w:r>
     </w:p>
@@ -4218,9 +4238,8 @@
           <w:rFonts w:eastAsia="맑은 고딕"/>
           <w:lang w:val="en-AU" w:eastAsia="ko-KR"/>
         </w:rPr>
-        <w:lastRenderedPageBreak/>
         <w:pict w14:anchorId="54A6968B">
-          <v:rect id="_x0000_i2184" style="width:0;height:1.5pt" o:hralign="center" o:hrstd="t" o:hr="t" fillcolor="#a0a0a0" stroked="f"/>
+          <v:rect id="_x0000_i1047" style="width:0;height:1.5pt" o:hralign="center" o:hrstd="t" o:hr="t" fillcolor="#a0a0a0" stroked="f"/>
         </w:pict>
       </w:r>
     </w:p>
@@ -4396,7 +4415,7 @@
           <w:lang w:val="en-AU" w:eastAsia="ko-KR"/>
         </w:rPr>
         <w:pict w14:anchorId="15EA24B2">
-          <v:rect id="_x0000_i2185" style="width:0;height:1.5pt" o:hralign="center" o:hrstd="t" o:hr="t" fillcolor="#a0a0a0" stroked="f"/>
+          <v:rect id="_x0000_i1048" style="width:0;height:1.5pt" o:hralign="center" o:hrstd="t" o:hr="t" fillcolor="#a0a0a0" stroked="f"/>
         </w:pict>
       </w:r>
     </w:p>
@@ -4561,7 +4580,7 @@
           <w:lang w:val="en-AU" w:eastAsia="ko-KR"/>
         </w:rPr>
         <w:pict w14:anchorId="528E7E1B">
-          <v:rect id="_x0000_i2186" style="width:0;height:1.5pt" o:hralign="center" o:hrstd="t" o:hr="t" fillcolor="#a0a0a0" stroked="f"/>
+          <v:rect id="_x0000_i1049" style="width:0;height:1.5pt" o:hralign="center" o:hrstd="t" o:hr="t" fillcolor="#a0a0a0" stroked="f"/>
         </w:pict>
       </w:r>
     </w:p>
@@ -4662,6 +4681,7 @@
           <w:rFonts w:ascii="Segoe UI Symbol" w:eastAsia="맑은 고딕" w:hAnsi="Segoe UI Symbol" w:cs="Segoe UI Symbol"/>
           <w:lang w:val="en-AU" w:eastAsia="ko-KR"/>
         </w:rPr>
+        <w:lastRenderedPageBreak/>
         <w:t>✗</w:t>
       </w:r>
       <w:r>
@@ -4706,9 +4726,8 @@
           <w:rFonts w:eastAsia="맑은 고딕"/>
           <w:lang w:val="en-AU" w:eastAsia="ko-KR"/>
         </w:rPr>
-        <w:lastRenderedPageBreak/>
         <w:pict w14:anchorId="3F88A98D">
-          <v:rect id="_x0000_i2187" style="width:0;height:1.5pt" o:hralign="center" o:hrstd="t" o:hr="t" fillcolor="#a0a0a0" stroked="f"/>
+          <v:rect id="_x0000_i1050" style="width:0;height:1.5pt" o:hralign="center" o:hrstd="t" o:hr="t" fillcolor="#a0a0a0" stroked="f"/>
         </w:pict>
       </w:r>
     </w:p>
@@ -5245,7 +5264,7 @@
     <w:p>
       <w:pPr>
         <w:rPr>
-          <w:rFonts w:eastAsia="맑은 고딕" w:hint="eastAsia"/>
+          <w:rFonts w:eastAsia="맑은 고딕"/>
           <w:lang w:val="en-AU" w:eastAsia="ko-KR"/>
         </w:rPr>
       </w:pPr>
@@ -5260,7 +5279,6 @@
       </w:pPr>
       <w:bookmarkStart w:id="11" w:name="_Toc235186558"/>
       <w:r>
-        <w:lastRenderedPageBreak/>
         <w:t>7. Visual Identity</w:t>
       </w:r>
       <w:bookmarkEnd w:id="11"/>
@@ -5342,7 +5360,7 @@
           <w:lang w:val="en-AU" w:eastAsia="ko-KR"/>
         </w:rPr>
         <w:pict w14:anchorId="29D41E2E">
-          <v:rect id="_x0000_i2188" style="width:0;height:1.5pt" o:hralign="center" o:hrstd="t" o:hr="t" fillcolor="#a0a0a0" stroked="f"/>
+          <v:rect id="_x0000_i1051" style="width:0;height:1.5pt" o:hralign="center" o:hrstd="t" o:hr="t" fillcolor="#a0a0a0" stroked="f"/>
         </w:pict>
       </w:r>
     </w:p>
@@ -5602,7 +5620,7 @@
           <w:lang w:val="en-AU" w:eastAsia="ko-KR"/>
         </w:rPr>
         <w:pict w14:anchorId="4996848E">
-          <v:rect id="_x0000_i2189" style="width:0;height:1.5pt" o:hralign="center" o:hrstd="t" o:hr="t" fillcolor="#a0a0a0" stroked="f"/>
+          <v:rect id="_x0000_i1052" style="width:0;height:1.5pt" o:hralign="center" o:hrstd="t" o:hr="t" fillcolor="#a0a0a0" stroked="f"/>
         </w:pict>
       </w:r>
     </w:p>
@@ -5709,6 +5727,7 @@
           <w:rFonts w:eastAsia="맑은 고딕"/>
           <w:lang w:val="en-AU" w:eastAsia="ko-KR"/>
         </w:rPr>
+        <w:lastRenderedPageBreak/>
         <w:t xml:space="preserve">Highly legible </w:t>
       </w:r>
     </w:p>
@@ -5743,7 +5762,6 @@
           <w:rFonts w:eastAsia="맑은 고딕"/>
           <w:lang w:val="en-AU" w:eastAsia="ko-KR"/>
         </w:rPr>
-        <w:lastRenderedPageBreak/>
         <w:t>Headings should be bold and confident.</w:t>
       </w:r>
     </w:p>
@@ -5775,7 +5793,7 @@
           <w:lang w:val="en-AU" w:eastAsia="ko-KR"/>
         </w:rPr>
         <w:pict w14:anchorId="2E681E1E">
-          <v:rect id="_x0000_i2190" style="width:0;height:1.5pt" o:hralign="center" o:hrstd="t" o:hr="t" fillcolor="#a0a0a0" stroked="f"/>
+          <v:rect id="_x0000_i1053" style="width:0;height:1.5pt" o:hralign="center" o:hrstd="t" o:hr="t" fillcolor="#a0a0a0" stroked="f"/>
         </w:pict>
       </w:r>
     </w:p>
@@ -5917,7 +5935,7 @@
           <w:lang w:val="en-AU" w:eastAsia="ko-KR"/>
         </w:rPr>
         <w:pict w14:anchorId="6B583944">
-          <v:rect id="_x0000_i2191" style="width:0;height:1.5pt" o:hralign="center" o:hrstd="t" o:hr="t" fillcolor="#a0a0a0" stroked="f"/>
+          <v:rect id="_x0000_i1054" style="width:0;height:1.5pt" o:hralign="center" o:hrstd="t" o:hr="t" fillcolor="#a0a0a0" stroked="f"/>
         </w:pict>
       </w:r>
     </w:p>
@@ -6131,7 +6149,7 @@
           <w:lang w:val="en-AU" w:eastAsia="ko-KR"/>
         </w:rPr>
         <w:pict w14:anchorId="3299D3C6">
-          <v:rect id="_x0000_i2192" style="width:0;height:1.5pt" o:hralign="center" o:hrstd="t" o:hr="t" fillcolor="#a0a0a0" stroked="f"/>
+          <v:rect id="_x0000_i1055" style="width:0;height:1.5pt" o:hralign="center" o:hrstd="t" o:hr="t" fillcolor="#a0a0a0" stroked="f"/>
         </w:pict>
       </w:r>
     </w:p>
@@ -6151,6 +6169,7 @@
           <w:bCs/>
           <w:lang w:val="en-AU" w:eastAsia="ko-KR"/>
         </w:rPr>
+        <w:lastRenderedPageBreak/>
         <w:t>Illustration Style</w:t>
       </w:r>
     </w:p>
@@ -6181,7 +6200,6 @@
           <w:rFonts w:eastAsia="맑은 고딕"/>
           <w:lang w:val="en-AU" w:eastAsia="ko-KR"/>
         </w:rPr>
-        <w:lastRenderedPageBreak/>
         <w:t>When used, they should support understanding rather than decoration.</w:t>
       </w:r>
     </w:p>
@@ -6213,7 +6231,7 @@
           <w:lang w:val="en-AU" w:eastAsia="ko-KR"/>
         </w:rPr>
         <w:pict w14:anchorId="525E2653">
-          <v:rect id="_x0000_i2193" style="width:0;height:1.5pt" o:hralign="center" o:hrstd="t" o:hr="t" fillcolor="#a0a0a0" stroked="f"/>
+          <v:rect id="_x0000_i1056" style="width:0;height:1.5pt" o:hralign="center" o:hrstd="t" o:hr="t" fillcolor="#a0a0a0" stroked="f"/>
         </w:pict>
       </w:r>
     </w:p>
@@ -6446,7 +6464,7 @@
           <w:lang w:val="en-AU" w:eastAsia="ko-KR"/>
         </w:rPr>
         <w:pict w14:anchorId="00F11E5D">
-          <v:rect id="_x0000_i2194" style="width:0;height:1.5pt" o:hralign="center" o:hrstd="t" o:hr="t" fillcolor="#a0a0a0" stroked="f"/>
+          <v:rect id="_x0000_i1057" style="width:0;height:1.5pt" o:hralign="center" o:hrstd="t" o:hr="t" fillcolor="#a0a0a0" stroked="f"/>
         </w:pict>
       </w:r>
     </w:p>
@@ -6617,13 +6635,14 @@
           <w:rFonts w:eastAsia="맑은 고딕"/>
           <w:lang w:val="en-AU" w:eastAsia="ko-KR"/>
         </w:rPr>
+        <w:lastRenderedPageBreak/>
         <w:t xml:space="preserve">Accessible interactive elements </w:t>
       </w:r>
     </w:p>
     <w:p>
       <w:pPr>
         <w:rPr>
-          <w:rFonts w:eastAsia="맑은 고딕" w:hint="eastAsia"/>
+          <w:rFonts w:eastAsia="맑은 고딕"/>
           <w:lang w:val="en-AU" w:eastAsia="ko-KR"/>
         </w:rPr>
       </w:pPr>
@@ -6645,7 +6664,6 @@
       </w:pPr>
       <w:bookmarkStart w:id="12" w:name="_Toc235186559"/>
       <w:r>
-        <w:lastRenderedPageBreak/>
         <w:t>8. Brand Messaging</w:t>
       </w:r>
       <w:bookmarkEnd w:id="12"/>
@@ -6714,7 +6732,7 @@
           <w:lang w:val="en-AU" w:eastAsia="ko-KR"/>
         </w:rPr>
         <w:pict w14:anchorId="6131C128">
-          <v:rect id="_x0000_i2195" style="width:0;height:1.5pt" o:hralign="center" o:hrstd="t" o:hr="t" fillcolor="#a0a0a0" stroked="f"/>
+          <v:rect id="_x0000_i1058" style="width:0;height:1.5pt" o:hralign="center" o:hrstd="t" o:hr="t" fillcolor="#a0a0a0" stroked="f"/>
         </w:pict>
       </w:r>
     </w:p>
@@ -6845,7 +6863,7 @@
           <w:lang w:val="en-AU" w:eastAsia="ko-KR"/>
         </w:rPr>
         <w:pict w14:anchorId="4CCC0960">
-          <v:rect id="_x0000_i2196" style="width:0;height:1.5pt" o:hralign="center" o:hrstd="t" o:hr="t" fillcolor="#a0a0a0" stroked="f"/>
+          <v:rect id="_x0000_i1059" style="width:0;height:1.5pt" o:hralign="center" o:hrstd="t" o:hr="t" fillcolor="#a0a0a0" stroked="f"/>
         </w:pict>
       </w:r>
     </w:p>
@@ -6882,349 +6900,334 @@
           <w:bCs/>
           <w:lang w:val="en-AU" w:eastAsia="ko-KR"/>
         </w:rPr>
-        <w:t>[Project Name] helps people discover trusted Korean local information, businesses, services, and community resources in Adelaide through one simple and modern platform.</w:t>
-      </w:r>
-    </w:p>
-    <w:p>
-      <w:pPr>
-        <w:rPr>
-          <w:rFonts w:eastAsia="맑은 고딕"/>
-          <w:lang w:val="en-AU" w:eastAsia="ko-KR"/>
-        </w:rPr>
-      </w:pPr>
-      <w:r>
-        <w:rPr>
-          <w:rFonts w:eastAsia="맑은 고딕"/>
-          <w:lang w:val="en-AU" w:eastAsia="ko-KR"/>
-        </w:rPr>
-        <w:t>Rather than searching across multiple websites, users can quickly find reliable information that supports everyday life.</w:t>
-      </w:r>
-    </w:p>
-    <w:p>
-      <w:pPr>
-        <w:rPr>
-          <w:rFonts w:eastAsia="맑은 고딕"/>
-          <w:lang w:val="en-AU" w:eastAsia="ko-KR"/>
-        </w:rPr>
-      </w:pPr>
-      <w:r>
-        <w:rPr>
-          <w:rFonts w:eastAsia="맑은 고딕"/>
-          <w:lang w:val="en-AU" w:eastAsia="ko-KR"/>
-        </w:rPr>
-        <w:pict w14:anchorId="4A908CA7">
-          <v:rect id="_x0000_i2197" style="width:0;height:1.5pt" o:hralign="center" o:hrstd="t" o:hr="t" fillcolor="#a0a0a0" stroked="f"/>
-        </w:pict>
-      </w:r>
-    </w:p>
-    <w:p>
-      <w:pPr>
+        <w:t>Discover Adelaide Korea</w:t>
+      </w:r>
+      <w:r>
         <w:rPr>
           <w:rFonts w:eastAsia="맑은 고딕"/>
           <w:b/>
           <w:bCs/>
           <w:lang w:val="en-AU" w:eastAsia="ko-KR"/>
         </w:rPr>
-      </w:pPr>
-      <w:r>
+        <w:t xml:space="preserve"> helps people discover trusted Korean local information, businesses, services, and community resources in Adelaide through one simple and modern platform.</w:t>
+      </w:r>
+    </w:p>
+    <w:p>
+      <w:pPr>
+        <w:rPr>
+          <w:rFonts w:eastAsia="맑은 고딕"/>
+          <w:lang w:val="en-AU" w:eastAsia="ko-KR"/>
+        </w:rPr>
+      </w:pPr>
+      <w:r>
+        <w:rPr>
+          <w:rFonts w:eastAsia="맑은 고딕"/>
+          <w:lang w:val="en-AU" w:eastAsia="ko-KR"/>
+        </w:rPr>
+        <w:t>Rather than searching across multiple websites, users can quickly find reliable information that supports everyday life.</w:t>
+      </w:r>
+    </w:p>
+    <w:p>
+      <w:pPr>
+        <w:rPr>
+          <w:rFonts w:eastAsia="맑은 고딕"/>
+          <w:lang w:val="en-AU" w:eastAsia="ko-KR"/>
+        </w:rPr>
+      </w:pPr>
+      <w:r>
+        <w:rPr>
+          <w:rFonts w:eastAsia="맑은 고딕"/>
+          <w:lang w:val="en-AU" w:eastAsia="ko-KR"/>
+        </w:rPr>
+        <w:pict w14:anchorId="4A908CA7">
+          <v:rect id="_x0000_i1060" style="width:0;height:1.5pt" o:hralign="center" o:hrstd="t" o:hr="t" fillcolor="#a0a0a0" stroked="f"/>
+        </w:pict>
+      </w:r>
+    </w:p>
+    <w:p>
+      <w:pPr>
         <w:rPr>
           <w:rFonts w:eastAsia="맑은 고딕"/>
           <w:b/>
           <w:bCs/>
           <w:lang w:val="en-AU" w:eastAsia="ko-KR"/>
         </w:rPr>
-        <w:t>Messaging Pillars</w:t>
-      </w:r>
-    </w:p>
-    <w:p>
-      <w:pPr>
+      </w:pPr>
+      <w:r>
         <w:rPr>
           <w:rFonts w:eastAsia="맑은 고딕"/>
           <w:b/>
           <w:bCs/>
           <w:lang w:val="en-AU" w:eastAsia="ko-KR"/>
         </w:rPr>
-      </w:pPr>
-      <w:r>
+        <w:t>Messaging Pillars</w:t>
+      </w:r>
+    </w:p>
+    <w:p>
+      <w:pPr>
         <w:rPr>
           <w:rFonts w:eastAsia="맑은 고딕"/>
           <w:b/>
           <w:bCs/>
           <w:lang w:val="en-AU" w:eastAsia="ko-KR"/>
         </w:rPr>
-        <w:t>Trust</w:t>
-      </w:r>
-    </w:p>
-    <w:p>
-      <w:pPr>
-        <w:rPr>
-          <w:rFonts w:eastAsia="맑은 고딕"/>
-          <w:lang w:val="en-AU" w:eastAsia="ko-KR"/>
-        </w:rPr>
-      </w:pPr>
-      <w:r>
-        <w:rPr>
-          <w:rFonts w:eastAsia="맑은 고딕"/>
-          <w:lang w:val="en-AU" w:eastAsia="ko-KR"/>
-        </w:rPr>
-        <w:t>Reliable information users can depend on.</w:t>
-      </w:r>
-    </w:p>
-    <w:p>
-      <w:pPr>
-        <w:rPr>
-          <w:rFonts w:eastAsia="맑은 고딕"/>
-          <w:lang w:val="en-AU" w:eastAsia="ko-KR"/>
-        </w:rPr>
-      </w:pPr>
-      <w:r>
-        <w:rPr>
-          <w:rFonts w:eastAsia="맑은 고딕"/>
-          <w:lang w:val="en-AU" w:eastAsia="ko-KR"/>
-        </w:rPr>
-        <w:pict w14:anchorId="2670C846">
-          <v:rect id="_x0000_i2198" style="width:0;height:1.5pt" o:hralign="center" o:hrstd="t" o:hr="t" fillcolor="#a0a0a0" stroked="f"/>
-        </w:pict>
-      </w:r>
-    </w:p>
-    <w:p>
-      <w:pPr>
+      </w:pPr>
+      <w:r>
         <w:rPr>
           <w:rFonts w:eastAsia="맑은 고딕"/>
           <w:b/>
           <w:bCs/>
           <w:lang w:val="en-AU" w:eastAsia="ko-KR"/>
         </w:rPr>
-      </w:pPr>
-      <w:r>
+        <w:t>Trust</w:t>
+      </w:r>
+    </w:p>
+    <w:p>
+      <w:pPr>
+        <w:rPr>
+          <w:rFonts w:eastAsia="맑은 고딕"/>
+          <w:lang w:val="en-AU" w:eastAsia="ko-KR"/>
+        </w:rPr>
+      </w:pPr>
+      <w:r>
+        <w:rPr>
+          <w:rFonts w:eastAsia="맑은 고딕"/>
+          <w:lang w:val="en-AU" w:eastAsia="ko-KR"/>
+        </w:rPr>
+        <w:t>Reliable information users can depend on.</w:t>
+      </w:r>
+    </w:p>
+    <w:p>
+      <w:pPr>
+        <w:rPr>
+          <w:rFonts w:eastAsia="맑은 고딕"/>
+          <w:lang w:val="en-AU" w:eastAsia="ko-KR"/>
+        </w:rPr>
+      </w:pPr>
+      <w:r>
+        <w:rPr>
+          <w:rFonts w:eastAsia="맑은 고딕"/>
+          <w:lang w:val="en-AU" w:eastAsia="ko-KR"/>
+        </w:rPr>
+        <w:pict w14:anchorId="2670C846">
+          <v:rect id="_x0000_i1061" style="width:0;height:1.5pt" o:hralign="center" o:hrstd="t" o:hr="t" fillcolor="#a0a0a0" stroked="f"/>
+        </w:pict>
+      </w:r>
+    </w:p>
+    <w:p>
+      <w:pPr>
         <w:rPr>
           <w:rFonts w:eastAsia="맑은 고딕"/>
           <w:b/>
           <w:bCs/>
           <w:lang w:val="en-AU" w:eastAsia="ko-KR"/>
         </w:rPr>
-        <w:t>Local</w:t>
-      </w:r>
-    </w:p>
-    <w:p>
-      <w:pPr>
-        <w:rPr>
-          <w:rFonts w:eastAsia="맑은 고딕"/>
-          <w:lang w:val="en-AU" w:eastAsia="ko-KR"/>
-        </w:rPr>
-      </w:pPr>
-      <w:r>
-        <w:rPr>
-          <w:rFonts w:eastAsia="맑은 고딕"/>
-          <w:lang w:val="en-AU" w:eastAsia="ko-KR"/>
-        </w:rPr>
-        <w:t>Focused specifically on Adelaide and the Korean community.</w:t>
-      </w:r>
-    </w:p>
-    <w:p>
-      <w:pPr>
-        <w:rPr>
-          <w:rFonts w:eastAsia="맑은 고딕"/>
-          <w:lang w:val="en-AU" w:eastAsia="ko-KR"/>
-        </w:rPr>
-      </w:pPr>
-      <w:r>
-        <w:rPr>
-          <w:rFonts w:eastAsia="맑은 고딕"/>
-          <w:lang w:val="en-AU" w:eastAsia="ko-KR"/>
-        </w:rPr>
-        <w:pict w14:anchorId="4FBFE498">
-          <v:rect id="_x0000_i2199" style="width:0;height:1.5pt" o:hralign="center" o:hrstd="t" o:hr="t" fillcolor="#a0a0a0" stroked="f"/>
-        </w:pict>
-      </w:r>
-    </w:p>
-    <w:p>
-      <w:pPr>
+      </w:pPr>
+      <w:r>
         <w:rPr>
           <w:rFonts w:eastAsia="맑은 고딕"/>
           <w:b/>
           <w:bCs/>
           <w:lang w:val="en-AU" w:eastAsia="ko-KR"/>
         </w:rPr>
-      </w:pPr>
-      <w:r>
+        <w:t>Local</w:t>
+      </w:r>
+    </w:p>
+    <w:p>
+      <w:pPr>
+        <w:rPr>
+          <w:rFonts w:eastAsia="맑은 고딕"/>
+          <w:lang w:val="en-AU" w:eastAsia="ko-KR"/>
+        </w:rPr>
+      </w:pPr>
+      <w:r>
+        <w:rPr>
+          <w:rFonts w:eastAsia="맑은 고딕"/>
+          <w:lang w:val="en-AU" w:eastAsia="ko-KR"/>
+        </w:rPr>
+        <w:t>Focused specifically on Adelaide and the Korean community.</w:t>
+      </w:r>
+    </w:p>
+    <w:p>
+      <w:pPr>
+        <w:rPr>
+          <w:rFonts w:eastAsia="맑은 고딕"/>
+          <w:lang w:val="en-AU" w:eastAsia="ko-KR"/>
+        </w:rPr>
+      </w:pPr>
+      <w:r>
+        <w:rPr>
+          <w:rFonts w:eastAsia="맑은 고딕"/>
+          <w:lang w:val="en-AU" w:eastAsia="ko-KR"/>
+        </w:rPr>
+        <w:pict w14:anchorId="4FBFE498">
+          <v:rect id="_x0000_i1062" style="width:0;height:1.5pt" o:hralign="center" o:hrstd="t" o:hr="t" fillcolor="#a0a0a0" stroked="f"/>
+        </w:pict>
+      </w:r>
+    </w:p>
+    <w:p>
+      <w:pPr>
         <w:rPr>
           <w:rFonts w:eastAsia="맑은 고딕"/>
           <w:b/>
           <w:bCs/>
           <w:lang w:val="en-AU" w:eastAsia="ko-KR"/>
         </w:rPr>
-        <w:t>Simplicity</w:t>
-      </w:r>
-    </w:p>
-    <w:p>
-      <w:pPr>
-        <w:rPr>
-          <w:rFonts w:eastAsia="맑은 고딕"/>
-          <w:lang w:val="en-AU" w:eastAsia="ko-KR"/>
-        </w:rPr>
-      </w:pPr>
-      <w:r>
-        <w:rPr>
-          <w:rFonts w:eastAsia="맑은 고딕"/>
-          <w:lang w:val="en-AU" w:eastAsia="ko-KR"/>
-        </w:rPr>
-        <w:t>Making complex local information easy to understand.</w:t>
-      </w:r>
-    </w:p>
-    <w:p>
-      <w:pPr>
-        <w:rPr>
-          <w:rFonts w:eastAsia="맑은 고딕"/>
-          <w:lang w:val="en-AU" w:eastAsia="ko-KR"/>
-        </w:rPr>
-      </w:pPr>
-      <w:r>
-        <w:rPr>
-          <w:rFonts w:eastAsia="맑은 고딕"/>
-          <w:lang w:val="en-AU" w:eastAsia="ko-KR"/>
-        </w:rPr>
-        <w:lastRenderedPageBreak/>
-        <w:pict w14:anchorId="0FB179C8">
-          <v:rect id="_x0000_i2200" style="width:0;height:1.5pt" o:hralign="center" o:hrstd="t" o:hr="t" fillcolor="#a0a0a0" stroked="f"/>
-        </w:pict>
-      </w:r>
-    </w:p>
-    <w:p>
-      <w:pPr>
+      </w:pPr>
+      <w:r>
         <w:rPr>
           <w:rFonts w:eastAsia="맑은 고딕"/>
           <w:b/>
           <w:bCs/>
           <w:lang w:val="en-AU" w:eastAsia="ko-KR"/>
         </w:rPr>
-      </w:pPr>
-      <w:r>
+        <w:lastRenderedPageBreak/>
+        <w:t>Simplicity</w:t>
+      </w:r>
+    </w:p>
+    <w:p>
+      <w:pPr>
+        <w:rPr>
+          <w:rFonts w:eastAsia="맑은 고딕"/>
+          <w:lang w:val="en-AU" w:eastAsia="ko-KR"/>
+        </w:rPr>
+      </w:pPr>
+      <w:r>
+        <w:rPr>
+          <w:rFonts w:eastAsia="맑은 고딕"/>
+          <w:lang w:val="en-AU" w:eastAsia="ko-KR"/>
+        </w:rPr>
+        <w:t>Making complex local information easy to understand.</w:t>
+      </w:r>
+    </w:p>
+    <w:p>
+      <w:pPr>
+        <w:rPr>
+          <w:rFonts w:eastAsia="맑은 고딕"/>
+          <w:lang w:val="en-AU" w:eastAsia="ko-KR"/>
+        </w:rPr>
+      </w:pPr>
+      <w:r>
+        <w:rPr>
+          <w:rFonts w:eastAsia="맑은 고딕"/>
+          <w:lang w:val="en-AU" w:eastAsia="ko-KR"/>
+        </w:rPr>
+        <w:pict w14:anchorId="0FB179C8">
+          <v:rect id="_x0000_i1063" style="width:0;height:1.5pt" o:hralign="center" o:hrstd="t" o:hr="t" fillcolor="#a0a0a0" stroked="f"/>
+        </w:pict>
+      </w:r>
+    </w:p>
+    <w:p>
+      <w:pPr>
         <w:rPr>
           <w:rFonts w:eastAsia="맑은 고딕"/>
           <w:b/>
           <w:bCs/>
           <w:lang w:val="en-AU" w:eastAsia="ko-KR"/>
         </w:rPr>
-        <w:t>Community</w:t>
-      </w:r>
-    </w:p>
-    <w:p>
-      <w:pPr>
-        <w:rPr>
-          <w:rFonts w:eastAsia="맑은 고딕"/>
-          <w:lang w:val="en-AU" w:eastAsia="ko-KR"/>
-        </w:rPr>
-      </w:pPr>
-      <w:r>
-        <w:rPr>
-          <w:rFonts w:eastAsia="맑은 고딕"/>
-          <w:lang w:val="en-AU" w:eastAsia="ko-KR"/>
-        </w:rPr>
-        <w:t>Connecting people, businesses, and local opportunities.</w:t>
-      </w:r>
-    </w:p>
-    <w:p>
-      <w:pPr>
-        <w:rPr>
-          <w:rFonts w:eastAsia="맑은 고딕"/>
-          <w:lang w:val="en-AU" w:eastAsia="ko-KR"/>
-        </w:rPr>
-      </w:pPr>
-      <w:r>
-        <w:rPr>
-          <w:rFonts w:eastAsia="맑은 고딕"/>
-          <w:lang w:val="en-AU" w:eastAsia="ko-KR"/>
-        </w:rPr>
-        <w:pict w14:anchorId="2699A9FA">
-          <v:rect id="_x0000_i2201" style="width:0;height:1.5pt" o:hralign="center" o:hrstd="t" o:hr="t" fillcolor="#a0a0a0" stroked="f"/>
-        </w:pict>
-      </w:r>
-    </w:p>
-    <w:p>
-      <w:pPr>
+      </w:pPr>
+      <w:r>
         <w:rPr>
           <w:rFonts w:eastAsia="맑은 고딕"/>
           <w:b/>
           <w:bCs/>
           <w:lang w:val="en-AU" w:eastAsia="ko-KR"/>
         </w:rPr>
-      </w:pPr>
-      <w:r>
+        <w:t>Community</w:t>
+      </w:r>
+    </w:p>
+    <w:p>
+      <w:pPr>
+        <w:rPr>
+          <w:rFonts w:eastAsia="맑은 고딕"/>
+          <w:lang w:val="en-AU" w:eastAsia="ko-KR"/>
+        </w:rPr>
+      </w:pPr>
+      <w:r>
+        <w:rPr>
+          <w:rFonts w:eastAsia="맑은 고딕"/>
+          <w:lang w:val="en-AU" w:eastAsia="ko-KR"/>
+        </w:rPr>
+        <w:t>Connecting people, businesses, and local opportunities.</w:t>
+      </w:r>
+    </w:p>
+    <w:p>
+      <w:pPr>
+        <w:rPr>
+          <w:rFonts w:eastAsia="맑은 고딕"/>
+          <w:lang w:val="en-AU" w:eastAsia="ko-KR"/>
+        </w:rPr>
+      </w:pPr>
+      <w:r>
+        <w:rPr>
+          <w:rFonts w:eastAsia="맑은 고딕"/>
+          <w:lang w:val="en-AU" w:eastAsia="ko-KR"/>
+        </w:rPr>
+        <w:pict w14:anchorId="2699A9FA">
+          <v:rect id="_x0000_i1064" style="width:0;height:1.5pt" o:hralign="center" o:hrstd="t" o:hr="t" fillcolor="#a0a0a0" stroked="f"/>
+        </w:pict>
+      </w:r>
+    </w:p>
+    <w:p>
+      <w:pPr>
         <w:rPr>
           <w:rFonts w:eastAsia="맑은 고딕"/>
           <w:b/>
           <w:bCs/>
           <w:lang w:val="en-AU" w:eastAsia="ko-KR"/>
         </w:rPr>
-        <w:t>Technology</w:t>
-      </w:r>
-    </w:p>
-    <w:p>
-      <w:pPr>
-        <w:rPr>
-          <w:rFonts w:eastAsia="맑은 고딕"/>
-          <w:lang w:val="en-AU" w:eastAsia="ko-KR"/>
-        </w:rPr>
-      </w:pPr>
-      <w:r>
-        <w:rPr>
-          <w:rFonts w:eastAsia="맑은 고딕"/>
-          <w:lang w:val="en-AU" w:eastAsia="ko-KR"/>
-        </w:rPr>
-        <w:t>Using modern technology to improve accessibility, discoverability, and user experience.</w:t>
-      </w:r>
-    </w:p>
-    <w:p>
-      <w:pPr>
-        <w:rPr>
-          <w:rFonts w:eastAsia="맑은 고딕"/>
-          <w:lang w:val="en-AU" w:eastAsia="ko-KR"/>
-        </w:rPr>
-      </w:pPr>
-      <w:r>
-        <w:rPr>
-          <w:rFonts w:eastAsia="맑은 고딕"/>
-          <w:lang w:val="en-AU" w:eastAsia="ko-KR"/>
-        </w:rPr>
-        <w:pict w14:anchorId="701A97C3">
-          <v:rect id="_x0000_i2202" style="width:0;height:1.5pt" o:hralign="center" o:hrstd="t" o:hr="t" fillcolor="#a0a0a0" stroked="f"/>
-        </w:pict>
-      </w:r>
-    </w:p>
-    <w:p>
-      <w:pPr>
+      </w:pPr>
+      <w:r>
         <w:rPr>
           <w:rFonts w:eastAsia="맑은 고딕"/>
           <w:b/>
           <w:bCs/>
           <w:lang w:val="en-AU" w:eastAsia="ko-KR"/>
         </w:rPr>
-      </w:pPr>
-      <w:r>
+        <w:t>Technology</w:t>
+      </w:r>
+    </w:p>
+    <w:p>
+      <w:pPr>
+        <w:rPr>
+          <w:rFonts w:eastAsia="맑은 고딕"/>
+          <w:lang w:val="en-AU" w:eastAsia="ko-KR"/>
+        </w:rPr>
+      </w:pPr>
+      <w:r>
+        <w:rPr>
+          <w:rFonts w:eastAsia="맑은 고딕"/>
+          <w:lang w:val="en-AU" w:eastAsia="ko-KR"/>
+        </w:rPr>
+        <w:t>Using modern technology to improve accessibility, discoverability, and user experience.</w:t>
+      </w:r>
+    </w:p>
+    <w:p>
+      <w:pPr>
+        <w:rPr>
+          <w:rFonts w:eastAsia="맑은 고딕"/>
+          <w:lang w:val="en-AU" w:eastAsia="ko-KR"/>
+        </w:rPr>
+      </w:pPr>
+      <w:r>
+        <w:rPr>
+          <w:rFonts w:eastAsia="맑은 고딕"/>
+          <w:lang w:val="en-AU" w:eastAsia="ko-KR"/>
+        </w:rPr>
+        <w:pict w14:anchorId="701A97C3">
+          <v:rect id="_x0000_i1065" style="width:0;height:1.5pt" o:hralign="center" o:hrstd="t" o:hr="t" fillcolor="#a0a0a0" stroked="f"/>
+        </w:pict>
+      </w:r>
+    </w:p>
+    <w:p>
+      <w:pPr>
         <w:rPr>
           <w:rFonts w:eastAsia="맑은 고딕"/>
           <w:b/>
           <w:bCs/>
           <w:lang w:val="en-AU" w:eastAsia="ko-KR"/>
         </w:rPr>
-        <w:t>Brand Promise</w:t>
-      </w:r>
-    </w:p>
-    <w:p>
-      <w:pPr>
-        <w:rPr>
-          <w:rFonts w:eastAsia="맑은 고딕"/>
-          <w:lang w:val="en-AU" w:eastAsia="ko-KR"/>
-        </w:rPr>
-      </w:pPr>
-      <w:r>
-        <w:rPr>
-          <w:rFonts w:eastAsia="맑은 고딕"/>
-          <w:lang w:val="en-AU" w:eastAsia="ko-KR"/>
-        </w:rPr>
-        <w:t xml:space="preserve">Whenever users visit </w:t>
-      </w:r>
+      </w:pPr>
       <w:r>
         <w:rPr>
           <w:rFonts w:eastAsia="맑은 고딕"/>
@@ -7232,7 +7235,31 @@
           <w:bCs/>
           <w:lang w:val="en-AU" w:eastAsia="ko-KR"/>
         </w:rPr>
-        <w:t>[Project Name]</w:t>
+        <w:t>Brand Promise</w:t>
+      </w:r>
+    </w:p>
+    <w:p>
+      <w:pPr>
+        <w:rPr>
+          <w:rFonts w:eastAsia="맑은 고딕"/>
+          <w:lang w:val="en-AU" w:eastAsia="ko-KR"/>
+        </w:rPr>
+      </w:pPr>
+      <w:r>
+        <w:rPr>
+          <w:rFonts w:eastAsia="맑은 고딕"/>
+          <w:lang w:val="en-AU" w:eastAsia="ko-KR"/>
+        </w:rPr>
+        <w:t xml:space="preserve">Whenever users visit </w:t>
+      </w:r>
+      <w:r>
+        <w:rPr>
+          <w:rFonts w:eastAsia="맑은 고딕"/>
+          <w:b/>
+          <w:bCs/>
+          <w:lang w:val="en-AU" w:eastAsia="ko-KR"/>
+        </w:rPr>
+        <w:t>Discover Adelaide Korea</w:t>
       </w:r>
       <w:r>
         <w:rPr>
@@ -7350,7 +7377,7 @@
           <w:lang w:val="en-AU" w:eastAsia="ko-KR"/>
         </w:rPr>
         <w:pict w14:anchorId="473CF9AB">
-          <v:rect id="_x0000_i2203" style="width:0;height:1.5pt" o:hralign="center" o:hrstd="t" o:hr="t" fillcolor="#a0a0a0" stroked="f"/>
+          <v:rect id="_x0000_i1066" style="width:0;height:1.5pt" o:hralign="center" o:hrstd="t" o:hr="t" fillcolor="#a0a0a0" stroked="f"/>
         </w:pict>
       </w:r>
     </w:p>
@@ -7387,70 +7414,62 @@
           <w:bCs/>
           <w:lang w:val="en-AU" w:eastAsia="ko-KR"/>
         </w:rPr>
-        <w:t>[Project Name] is an AI-powered Korean local lifestyle platform that helps people living in Adelaide quickly discover trusted local information, businesses, services, and community resources—all in one place.</w:t>
-      </w:r>
-    </w:p>
-    <w:p>
-      <w:pPr>
-        <w:rPr>
-          <w:rFonts w:eastAsia="맑은 고딕"/>
-          <w:lang w:val="en-AU" w:eastAsia="ko-KR"/>
-        </w:rPr>
-      </w:pPr>
-      <w:r>
-        <w:rPr>
-          <w:rFonts w:eastAsia="맑은 고딕"/>
-          <w:lang w:val="en-AU" w:eastAsia="ko-KR"/>
-        </w:rPr>
-        <w:pict w14:anchorId="0942E945">
-          <v:rect id="_x0000_i2204" style="width:0;height:1.5pt" o:hralign="center" o:hrstd="t" o:hr="t" fillcolor="#a0a0a0" stroked="f"/>
-        </w:pict>
-      </w:r>
-    </w:p>
-    <w:p>
-      <w:pPr>
+        <w:t>Discover Adelaide Korea</w:t>
+      </w:r>
+      <w:r>
         <w:rPr>
           <w:rFonts w:eastAsia="맑은 고딕"/>
           <w:b/>
           <w:bCs/>
           <w:lang w:val="en-AU" w:eastAsia="ko-KR"/>
         </w:rPr>
-      </w:pPr>
-      <w:r>
+        <w:t xml:space="preserve"> is an AI-powered Korean local lifestyle platform that helps people living in Adelaide quickly discover trusted local information, businesses, services, and community resources—all in one place.</w:t>
+      </w:r>
+    </w:p>
+    <w:p>
+      <w:pPr>
+        <w:rPr>
+          <w:rFonts w:eastAsia="맑은 고딕"/>
+          <w:lang w:val="en-AU" w:eastAsia="ko-KR"/>
+        </w:rPr>
+      </w:pPr>
+      <w:r>
+        <w:rPr>
+          <w:rFonts w:eastAsia="맑은 고딕"/>
+          <w:lang w:val="en-AU" w:eastAsia="ko-KR"/>
+        </w:rPr>
+        <w:pict w14:anchorId="0942E945">
+          <v:rect id="_x0000_i1067" style="width:0;height:1.5pt" o:hralign="center" o:hrstd="t" o:hr="t" fillcolor="#a0a0a0" stroked="f"/>
+        </w:pict>
+      </w:r>
+    </w:p>
+    <w:p>
+      <w:pPr>
         <w:rPr>
           <w:rFonts w:eastAsia="맑은 고딕"/>
           <w:b/>
           <w:bCs/>
           <w:lang w:val="en-AU" w:eastAsia="ko-KR"/>
         </w:rPr>
-        <w:t>Homepage Hero Message</w:t>
-      </w:r>
-    </w:p>
-    <w:p>
-      <w:pPr>
+      </w:pPr>
+      <w:r>
         <w:rPr>
           <w:rFonts w:eastAsia="맑은 고딕"/>
           <w:b/>
           <w:bCs/>
           <w:lang w:val="en-AU" w:eastAsia="ko-KR"/>
         </w:rPr>
-      </w:pPr>
-      <w:r>
+        <w:t>Homepage Hero Message</w:t>
+      </w:r>
+    </w:p>
+    <w:p>
+      <w:pPr>
         <w:rPr>
           <w:rFonts w:eastAsia="맑은 고딕"/>
           <w:b/>
           <w:bCs/>
           <w:lang w:val="en-AU" w:eastAsia="ko-KR"/>
         </w:rPr>
-        <w:t>Headline</w:t>
-      </w:r>
-    </w:p>
-    <w:p>
-      <w:pPr>
-        <w:rPr>
-          <w:rFonts w:eastAsia="맑은 고딕"/>
-          <w:lang w:val="en-AU" w:eastAsia="ko-KR"/>
-        </w:rPr>
       </w:pPr>
       <w:r>
         <w:rPr>
@@ -7459,68 +7478,69 @@
           <w:bCs/>
           <w:lang w:val="en-AU" w:eastAsia="ko-KR"/>
         </w:rPr>
-        <w:t>Everything Korean in Adelaide. All in One Place.</w:t>
-      </w:r>
-    </w:p>
-    <w:p>
-      <w:pPr>
+        <w:t>Headline</w:t>
+      </w:r>
+    </w:p>
+    <w:p>
+      <w:pPr>
+        <w:rPr>
+          <w:rFonts w:eastAsia="맑은 고딕"/>
+          <w:lang w:val="en-AU" w:eastAsia="ko-KR"/>
+        </w:rPr>
+      </w:pPr>
+      <w:r>
         <w:rPr>
           <w:rFonts w:eastAsia="맑은 고딕"/>
           <w:b/>
           <w:bCs/>
           <w:lang w:val="en-AU" w:eastAsia="ko-KR"/>
         </w:rPr>
-      </w:pPr>
-      <w:r>
+        <w:t>Everything Korean in Adelaide. All in One Place.</w:t>
+      </w:r>
+    </w:p>
+    <w:p>
+      <w:pPr>
         <w:rPr>
           <w:rFonts w:eastAsia="맑은 고딕"/>
           <w:b/>
           <w:bCs/>
           <w:lang w:val="en-AU" w:eastAsia="ko-KR"/>
         </w:rPr>
-        <w:t>Supporting Text</w:t>
-      </w:r>
-    </w:p>
-    <w:p>
-      <w:pPr>
-        <w:rPr>
-          <w:rFonts w:eastAsia="맑은 고딕"/>
-          <w:lang w:val="en-AU" w:eastAsia="ko-KR"/>
-        </w:rPr>
-      </w:pPr>
-      <w:r>
-        <w:rPr>
-          <w:rFonts w:eastAsia="맑은 고딕"/>
-          <w:lang w:val="en-AU" w:eastAsia="ko-KR"/>
-        </w:rPr>
-        <w:t>Discover trusted local information, businesses, services, events, and practical guides designed to make everyday life in Adelaide simpler.</w:t>
-      </w:r>
-    </w:p>
-    <w:p>
-      <w:pPr>
+      </w:pPr>
+      <w:r>
         <w:rPr>
           <w:rFonts w:eastAsia="맑은 고딕"/>
           <w:b/>
           <w:bCs/>
           <w:lang w:val="en-AU" w:eastAsia="ko-KR"/>
         </w:rPr>
-      </w:pPr>
-      <w:r>
+        <w:t>Supporting Text</w:t>
+      </w:r>
+    </w:p>
+    <w:p>
+      <w:pPr>
+        <w:rPr>
+          <w:rFonts w:eastAsia="맑은 고딕"/>
+          <w:lang w:val="en-AU" w:eastAsia="ko-KR"/>
+        </w:rPr>
+      </w:pPr>
+      <w:r>
+        <w:rPr>
+          <w:rFonts w:eastAsia="맑은 고딕"/>
+          <w:lang w:val="en-AU" w:eastAsia="ko-KR"/>
+        </w:rPr>
+        <w:lastRenderedPageBreak/>
+        <w:t>Discover trusted local information, businesses, services, events, and practical guides designed to make everyday life in Adelaide simpler.</w:t>
+      </w:r>
+    </w:p>
+    <w:p>
+      <w:pPr>
         <w:rPr>
           <w:rFonts w:eastAsia="맑은 고딕"/>
           <w:b/>
           <w:bCs/>
           <w:lang w:val="en-AU" w:eastAsia="ko-KR"/>
         </w:rPr>
-        <w:t>Primary CTA</w:t>
-      </w:r>
-    </w:p>
-    <w:p>
-      <w:pPr>
-        <w:rPr>
-          <w:rFonts w:eastAsia="맑은 고딕"/>
-          <w:lang w:val="en-AU" w:eastAsia="ko-KR"/>
-        </w:rPr>
       </w:pPr>
       <w:r>
         <w:rPr>
@@ -7529,35 +7549,34 @@
           <w:bCs/>
           <w:lang w:val="en-AU" w:eastAsia="ko-KR"/>
         </w:rPr>
-        <w:lastRenderedPageBreak/>
-        <w:t>Explore Adelaide</w:t>
-      </w:r>
-    </w:p>
-    <w:p>
-      <w:pPr>
+        <w:t>Primary CTA</w:t>
+      </w:r>
+    </w:p>
+    <w:p>
+      <w:pPr>
+        <w:rPr>
+          <w:rFonts w:eastAsia="맑은 고딕"/>
+          <w:lang w:val="en-AU" w:eastAsia="ko-KR"/>
+        </w:rPr>
+      </w:pPr>
+      <w:r>
         <w:rPr>
           <w:rFonts w:eastAsia="맑은 고딕"/>
           <w:b/>
           <w:bCs/>
           <w:lang w:val="en-AU" w:eastAsia="ko-KR"/>
         </w:rPr>
-      </w:pPr>
-      <w:r>
+        <w:t>Explore Adelaide</w:t>
+      </w:r>
+    </w:p>
+    <w:p>
+      <w:pPr>
         <w:rPr>
           <w:rFonts w:eastAsia="맑은 고딕"/>
           <w:b/>
           <w:bCs/>
           <w:lang w:val="en-AU" w:eastAsia="ko-KR"/>
         </w:rPr>
-        <w:t>Secondary CTA</w:t>
-      </w:r>
-    </w:p>
-    <w:p>
-      <w:pPr>
-        <w:rPr>
-          <w:rFonts w:eastAsia="맑은 고딕"/>
-          <w:lang w:val="en-AU" w:eastAsia="ko-KR"/>
-        </w:rPr>
       </w:pPr>
       <w:r>
         <w:rPr>
@@ -7566,6 +7585,23 @@
           <w:bCs/>
           <w:lang w:val="en-AU" w:eastAsia="ko-KR"/>
         </w:rPr>
+        <w:t>Secondary CTA</w:t>
+      </w:r>
+    </w:p>
+    <w:p>
+      <w:pPr>
+        <w:rPr>
+          <w:rFonts w:eastAsia="맑은 고딕"/>
+          <w:lang w:val="en-AU" w:eastAsia="ko-KR"/>
+        </w:rPr>
+      </w:pPr>
+      <w:r>
+        <w:rPr>
+          <w:rFonts w:eastAsia="맑은 고딕"/>
+          <w:b/>
+          <w:bCs/>
+          <w:lang w:val="en-AU" w:eastAsia="ko-KR"/>
+        </w:rPr>
         <w:t>Find Local Businesses</w:t>
       </w:r>
     </w:p>
@@ -7582,7 +7618,7 @@
           <w:lang w:val="en-AU" w:eastAsia="ko-KR"/>
         </w:rPr>
         <w:pict w14:anchorId="66FBAEDE">
-          <v:rect id="_x0000_i2205" style="width:0;height:1.5pt" o:hralign="center" o:hrstd="t" o:hr="t" fillcolor="#a0a0a0" stroked="f"/>
+          <v:rect id="_x0000_i1068" style="width:0;height:1.5pt" o:hralign="center" o:hrstd="t" o:hr="t" fillcolor="#a0a0a0" stroked="f"/>
         </w:pict>
       </w:r>
     </w:p>
@@ -7822,7 +7858,7 @@
     <w:p>
       <w:pPr>
         <w:rPr>
-          <w:rFonts w:eastAsia="맑은 고딕" w:hint="eastAsia"/>
+          <w:rFonts w:eastAsia="맑은 고딕"/>
           <w:lang w:eastAsia="ko-KR"/>
         </w:rPr>
       </w:pPr>
@@ -7837,7 +7873,6 @@
       </w:pPr>
       <w:bookmarkStart w:id="13" w:name="_Toc235186560"/>
       <w:r>
-        <w:lastRenderedPageBreak/>
         <w:t>9. Brand Assets</w:t>
       </w:r>
       <w:bookmarkEnd w:id="13"/>
@@ -8008,7 +8043,7 @@
           <w:lang w:val="en-AU" w:eastAsia="ko-KR"/>
         </w:rPr>
         <w:pict w14:anchorId="191BFBF1">
-          <v:rect id="_x0000_i2206" style="width:0;height:1.5pt" o:hralign="center" o:hrstd="t" o:hr="t" fillcolor="#a0a0a0" stroked="f"/>
+          <v:rect id="_x0000_i1069" style="width:0;height:1.5pt" o:hralign="center" o:hrstd="t" o:hr="t" fillcolor="#a0a0a0" stroked="f"/>
         </w:pict>
       </w:r>
     </w:p>
@@ -8052,7 +8087,7 @@
           <w:rFonts w:eastAsia="맑은 고딕"/>
           <w:lang w:val="en-AU" w:eastAsia="ko-KR"/>
         </w:rPr>
-        <w:t xml:space="preserve"> To Be Registered</w:t>
+        <w:t xml:space="preserve"> Registered</w:t>
       </w:r>
     </w:p>
     <w:p>
@@ -8083,10 +8118,17 @@
       </w:pPr>
       <w:r>
         <w:rPr>
-          <w:rFonts w:eastAsia="맑은 고딕"/>
-          <w:lang w:val="en-AU" w:eastAsia="ko-KR"/>
-        </w:rPr>
-        <w:t xml:space="preserve">.com.au </w:t>
+          <w:rFonts w:eastAsia="맑은 고딕" w:hint="eastAsia"/>
+          <w:lang w:val="en-AU" w:eastAsia="ko-KR"/>
+        </w:rPr>
+        <w:t>discoveradelaidekorea</w:t>
+      </w:r>
+      <w:r>
+        <w:rPr>
+          <w:rFonts w:eastAsia="맑은 고딕"/>
+          <w:lang w:val="en-AU" w:eastAsia="ko-KR"/>
+        </w:rPr>
+        <w:t xml:space="preserve">.au </w:t>
       </w:r>
     </w:p>
     <w:p>
@@ -8102,6 +8144,13 @@
       </w:pPr>
       <w:r>
         <w:rPr>
+          <w:rFonts w:eastAsia="맑은 고딕" w:hint="eastAsia"/>
+          <w:lang w:val="en-AU" w:eastAsia="ko-KR"/>
+        </w:rPr>
+        <w:t>discoveradelaidekorea</w:t>
+      </w:r>
+      <w:r>
+        <w:rPr>
           <w:rFonts w:eastAsia="맑은 고딕"/>
           <w:lang w:val="en-AU" w:eastAsia="ko-KR"/>
         </w:rPr>
@@ -8120,23 +8169,8 @@
           <w:rFonts w:eastAsia="맑은 고딕"/>
           <w:lang w:val="en-AU" w:eastAsia="ko-KR"/>
         </w:rPr>
-        <w:t>The domain should match the official brand name whenever possible.</w:t>
-      </w:r>
-    </w:p>
-    <w:p>
-      <w:pPr>
-        <w:rPr>
-          <w:rFonts w:eastAsia="맑은 고딕"/>
-          <w:lang w:val="en-AU" w:eastAsia="ko-KR"/>
-        </w:rPr>
-      </w:pPr>
-      <w:r>
-        <w:rPr>
-          <w:rFonts w:eastAsia="맑은 고딕"/>
-          <w:lang w:val="en-AU" w:eastAsia="ko-KR"/>
-        </w:rPr>
         <w:pict w14:anchorId="619D1215">
-          <v:rect id="_x0000_i2207" style="width:0;height:1.5pt" o:hralign="center" o:hrstd="t" o:hr="t" fillcolor="#a0a0a0" stroked="f"/>
+          <v:rect id="_x0000_i1070" style="width:0;height:1.5pt" o:hralign="center" o:hrstd="t" o:hr="t" fillcolor="#a0a0a0" stroked="f"/>
         </w:pict>
       </w:r>
     </w:p>
@@ -8172,6 +8206,38 @@
           <w:lang w:val="en-AU" w:eastAsia="ko-KR"/>
         </w:rPr>
         <w:t>Reserve consistent usernames across major platforms.</w:t>
+      </w:r>
+    </w:p>
+    <w:p>
+      <w:pPr>
+        <w:rPr>
+          <w:rFonts w:eastAsia="맑은 고딕" w:hint="eastAsia"/>
+          <w:lang w:val="en-AU" w:eastAsia="ko-KR"/>
+        </w:rPr>
+      </w:pPr>
+      <w:r>
+        <w:rPr>
+          <w:rFonts w:eastAsia="맑은 고딕"/>
+          <w:lang w:val="en-AU" w:eastAsia="ko-KR"/>
+        </w:rPr>
+        <w:t xml:space="preserve">under </w:t>
+      </w:r>
+      <w:hyperlink r:id="rId6" w:history="1">
+        <w:r>
+          <w:rPr>
+            <w:rStyle w:val="Hyperlink"/>
+            <w:rFonts w:eastAsia="맑은 고딕"/>
+            <w:lang w:val="en-AU" w:eastAsia="ko-KR"/>
+          </w:rPr>
+          <w:t>youcandoitgonie@gmail.com</w:t>
+        </w:r>
+      </w:hyperlink>
+      <w:r>
+        <w:rPr>
+          <w:rFonts w:eastAsia="맑은 고딕" w:hint="eastAsia"/>
+          <w:lang w:val="en-AU" w:eastAsia="ko-KR"/>
+        </w:rPr>
+        <w:t xml:space="preserve"> </w:t>
       </w:r>
     </w:p>
     <w:p>
@@ -8281,6 +8347,7 @@
           <w:rFonts w:eastAsia="맑은 고딕"/>
           <w:lang w:val="en-AU" w:eastAsia="ko-KR"/>
         </w:rPr>
+        <w:lastRenderedPageBreak/>
         <w:t xml:space="preserve">LinkedIn </w:t>
       </w:r>
     </w:p>
@@ -8311,9 +8378,8 @@
           <w:rFonts w:eastAsia="맑은 고딕"/>
           <w:lang w:val="en-AU" w:eastAsia="ko-KR"/>
         </w:rPr>
-        <w:lastRenderedPageBreak/>
         <w:pict w14:anchorId="61CB9F0C">
-          <v:rect id="_x0000_i2208" style="width:0;height:1.5pt" o:hralign="center" o:hrstd="t" o:hr="t" fillcolor="#a0a0a0" stroked="f"/>
+          <v:rect id="_x0000_i1071" style="width:0;height:1.5pt" o:hralign="center" o:hrstd="t" o:hr="t" fillcolor="#a0a0a0" stroked="f"/>
         </w:pict>
       </w:r>
     </w:p>
@@ -8455,7 +8521,7 @@
           <w:lang w:val="en-AU" w:eastAsia="ko-KR"/>
         </w:rPr>
         <w:pict w14:anchorId="5BA16D05">
-          <v:rect id="_x0000_i2209" style="width:0;height:1.5pt" o:hralign="center" o:hrstd="t" o:hr="t" fillcolor="#a0a0a0" stroked="f"/>
+          <v:rect id="_x0000_i1072" style="width:0;height:1.5pt" o:hralign="center" o:hrstd="t" o:hr="t" fillcolor="#a0a0a0" stroked="f"/>
         </w:pict>
       </w:r>
     </w:p>
@@ -8639,7 +8705,7 @@
           <w:lang w:val="en-AU" w:eastAsia="ko-KR"/>
         </w:rPr>
         <w:pict w14:anchorId="5AE0349A">
-          <v:rect id="_x0000_i2210" style="width:0;height:1.5pt" o:hralign="center" o:hrstd="t" o:hr="t" fillcolor="#a0a0a0" stroked="f"/>
+          <v:rect id="_x0000_i1073" style="width:0;height:1.5pt" o:hralign="center" o:hrstd="t" o:hr="t" fillcolor="#a0a0a0" stroked="f"/>
         </w:pict>
       </w:r>
     </w:p>
@@ -8759,6 +8825,7 @@
           <w:rFonts w:eastAsia="맑은 고딕"/>
           <w:lang w:val="en-AU" w:eastAsia="ko-KR"/>
         </w:rPr>
+        <w:lastRenderedPageBreak/>
         <w:t xml:space="preserve">Iconography </w:t>
       </w:r>
     </w:p>
@@ -8797,7 +8864,6 @@
           <w:rFonts w:eastAsia="맑은 고딕"/>
           <w:lang w:val="en-AU" w:eastAsia="ko-KR"/>
         </w:rPr>
-        <w:lastRenderedPageBreak/>
         <w:t xml:space="preserve">Voice &amp; tone </w:t>
       </w:r>
     </w:p>
@@ -8814,7 +8880,7 @@
           <w:lang w:val="en-AU" w:eastAsia="ko-KR"/>
         </w:rPr>
         <w:pict w14:anchorId="664EE557">
-          <v:rect id="_x0000_i2211" style="width:0;height:1.5pt" o:hralign="center" o:hrstd="t" o:hr="t" fillcolor="#a0a0a0" stroked="f"/>
+          <v:rect id="_x0000_i1074" style="width:0;height:1.5pt" o:hralign="center" o:hrstd="t" o:hr="t" fillcolor="#a0a0a0" stroked="f"/>
         </w:pict>
       </w:r>
     </w:p>
@@ -8979,7 +9045,7 @@
           <w:lang w:val="en-AU" w:eastAsia="ko-KR"/>
         </w:rPr>
         <w:pict w14:anchorId="7BC11BEF">
-          <v:rect id="_x0000_i2212" style="width:0;height:1.5pt" o:hralign="center" o:hrstd="t" o:hr="t" fillcolor="#a0a0a0" stroked="f"/>
+          <v:rect id="_x0000_i1075" style="width:0;height:1.5pt" o:hralign="center" o:hrstd="t" o:hr="t" fillcolor="#a0a0a0" stroked="f"/>
         </w:pict>
       </w:r>
     </w:p>
@@ -9160,7 +9226,7 @@
     <w:p>
       <w:pPr>
         <w:rPr>
-          <w:rFonts w:eastAsia="맑은 고딕" w:hint="eastAsia"/>
+          <w:rFonts w:eastAsia="맑은 고딕"/>
           <w:lang w:eastAsia="ko-KR"/>
         </w:rPr>
       </w:pPr>
@@ -9175,7 +9241,6 @@
       </w:pPr>
       <w:bookmarkStart w:id="14" w:name="_Toc235186561"/>
       <w:r>
-        <w:lastRenderedPageBreak/>
         <w:t>10. Success Criteria</w:t>
       </w:r>
       <w:bookmarkEnd w:id="14"/>
@@ -9235,7 +9300,7 @@
           <w:bCs/>
           <w:lang w:val="en-AU" w:eastAsia="ko-KR"/>
         </w:rPr>
-        <w:t>[Project Name]</w:t>
+        <w:t>Discover Adelaide Korea</w:t>
       </w:r>
       <w:r>
         <w:rPr>
@@ -9258,7 +9323,7 @@
           <w:lang w:val="en-AU" w:eastAsia="ko-KR"/>
         </w:rPr>
         <w:pict w14:anchorId="0D5F5157">
-          <v:rect id="_x0000_i2213" style="width:0;height:1.5pt" o:hralign="center" o:hrstd="t" o:hr="t" fillcolor="#a0a0a0" stroked="f"/>
+          <v:rect id="_x0000_i1076" style="width:0;height:1.5pt" o:hralign="center" o:hrstd="t" o:hr="t" fillcolor="#a0a0a0" stroked="f"/>
         </w:pict>
       </w:r>
     </w:p>
@@ -9324,7 +9389,7 @@
           <w:lang w:val="en-AU" w:eastAsia="ko-KR"/>
         </w:rPr>
         <w:pict w14:anchorId="1CC02D9B">
-          <v:rect id="_x0000_i2214" style="width:0;height:1.5pt" o:hralign="center" o:hrstd="t" o:hr="t" fillcolor="#a0a0a0" stroked="f"/>
+          <v:rect id="_x0000_i1077" style="width:0;height:1.5pt" o:hralign="center" o:hrstd="t" o:hr="t" fillcolor="#a0a0a0" stroked="f"/>
         </w:pict>
       </w:r>
     </w:p>
@@ -9375,7 +9440,7 @@
           <w:lang w:val="en-AU" w:eastAsia="ko-KR"/>
         </w:rPr>
         <w:pict w14:anchorId="13A2533A">
-          <v:rect id="_x0000_i2215" style="width:0;height:1.5pt" o:hralign="center" o:hrstd="t" o:hr="t" fillcolor="#a0a0a0" stroked="f"/>
+          <v:rect id="_x0000_i1078" style="width:0;height:1.5pt" o:hralign="center" o:hrstd="t" o:hr="t" fillcolor="#a0a0a0" stroked="f"/>
         </w:pict>
       </w:r>
     </w:p>
@@ -9441,7 +9506,7 @@
           <w:lang w:val="en-AU" w:eastAsia="ko-KR"/>
         </w:rPr>
         <w:pict w14:anchorId="555F8939">
-          <v:rect id="_x0000_i2216" style="width:0;height:1.5pt" o:hralign="center" o:hrstd="t" o:hr="t" fillcolor="#a0a0a0" stroked="f"/>
+          <v:rect id="_x0000_i1079" style="width:0;height:1.5pt" o:hralign="center" o:hrstd="t" o:hr="t" fillcolor="#a0a0a0" stroked="f"/>
         </w:pict>
       </w:r>
     </w:p>
@@ -9507,7 +9572,7 @@
           <w:lang w:val="en-AU" w:eastAsia="ko-KR"/>
         </w:rPr>
         <w:pict w14:anchorId="4D202F8A">
-          <v:rect id="_x0000_i2217" style="width:0;height:1.5pt" o:hralign="center" o:hrstd="t" o:hr="t" fillcolor="#a0a0a0" stroked="f"/>
+          <v:rect id="_x0000_i1080" style="width:0;height:1.5pt" o:hralign="center" o:hrstd="t" o:hr="t" fillcolor="#a0a0a0" stroked="f"/>
         </w:pict>
       </w:r>
     </w:p>
@@ -9542,6 +9607,7 @@
           <w:rFonts w:eastAsia="맑은 고딕"/>
           <w:lang w:val="en-AU" w:eastAsia="ko-KR"/>
         </w:rPr>
+        <w:lastRenderedPageBreak/>
         <w:t xml:space="preserve">The long-term success of </w:t>
       </w:r>
       <w:r>
@@ -9551,7 +9617,7 @@
           <w:bCs/>
           <w:lang w:val="en-AU" w:eastAsia="ko-KR"/>
         </w:rPr>
-        <w:t>[Project Name]</w:t>
+        <w:t>Discover Adelaide Korea</w:t>
       </w:r>
       <w:r>
         <w:rPr>
@@ -9596,7 +9662,6 @@
           <w:rFonts w:eastAsia="맑은 고딕"/>
           <w:lang w:val="en-AU" w:eastAsia="ko-KR"/>
         </w:rPr>
-        <w:lastRenderedPageBreak/>
         <w:t xml:space="preserve">The preferred destination for discovering Korean businesses and services. </w:t>
       </w:r>
     </w:p>
@@ -9798,7 +9863,7 @@
     <w:p>
       <w:pPr>
         <w:rPr>
-          <w:rFonts w:eastAsia="맑은 고딕" w:hint="eastAsia"/>
+          <w:rFonts w:eastAsia="맑은 고딕"/>
           <w:lang w:val="en-AU" w:eastAsia="ko-KR"/>
         </w:rPr>
       </w:pPr>
@@ -9813,7 +9878,6 @@
       </w:pPr>
       <w:bookmarkStart w:id="15" w:name="_Toc235186562"/>
       <w:r>
-        <w:lastRenderedPageBreak/>
         <w:t>1</w:t>
       </w:r>
       <w:r>
@@ -9973,7 +10037,7 @@
           <w:lang w:val="en-AU" w:eastAsia="ko-KR"/>
         </w:rPr>
         <w:pict w14:anchorId="0600BB85">
-          <v:rect id="_x0000_i1986" style="width:0;height:1.5pt" o:hralign="center" o:hrstd="t" o:hr="t" fillcolor="#a0a0a0" stroked="f"/>
+          <v:rect id="_x0000_i1081" style="width:0;height:1.5pt" o:hralign="center" o:hrstd="t" o:hr="t" fillcolor="#a0a0a0" stroked="f"/>
         </w:pict>
       </w:r>
     </w:p>
@@ -10115,7 +10179,7 @@
           <w:lang w:val="en-AU" w:eastAsia="ko-KR"/>
         </w:rPr>
         <w:pict w14:anchorId="65268999">
-          <v:rect id="_x0000_i1987" style="width:0;height:1.5pt" o:hralign="center" o:hrstd="t" o:hr="t" fillcolor="#a0a0a0" stroked="f"/>
+          <v:rect id="_x0000_i1082" style="width:0;height:1.5pt" o:hralign="center" o:hrstd="t" o:hr="t" fillcolor="#a0a0a0" stroked="f"/>
         </w:pict>
       </w:r>
     </w:p>
@@ -10241,6 +10305,7 @@
           <w:rFonts w:eastAsia="맑은 고딕"/>
           <w:lang w:val="en-AU" w:eastAsia="ko-KR"/>
         </w:rPr>
+        <w:lastRenderedPageBreak/>
         <w:t xml:space="preserve">Visual communication </w:t>
       </w:r>
     </w:p>
@@ -10275,9 +10340,8 @@
           <w:rFonts w:eastAsia="맑은 고딕"/>
           <w:lang w:val="en-AU" w:eastAsia="ko-KR"/>
         </w:rPr>
-        <w:lastRenderedPageBreak/>
         <w:pict w14:anchorId="127999D6">
-          <v:rect id="_x0000_i1988" style="width:0;height:1.5pt" o:hralign="center" o:hrstd="t" o:hr="t" fillcolor="#a0a0a0" stroked="f"/>
+          <v:rect id="_x0000_i1083" style="width:0;height:1.5pt" o:hralign="center" o:hrstd="t" o:hr="t" fillcolor="#a0a0a0" stroked="f"/>
         </w:pict>
       </w:r>
     </w:p>
@@ -10419,7 +10483,7 @@
           <w:lang w:val="en-AU" w:eastAsia="ko-KR"/>
         </w:rPr>
         <w:pict w14:anchorId="5E0F65C1">
-          <v:rect id="_x0000_i1989" style="width:0;height:1.5pt" o:hralign="center" o:hrstd="t" o:hr="t" fillcolor="#a0a0a0" stroked="f"/>
+          <v:rect id="_x0000_i1084" style="width:0;height:1.5pt" o:hralign="center" o:hrstd="t" o:hr="t" fillcolor="#a0a0a0" stroked="f"/>
         </w:pict>
       </w:r>
     </w:p>
@@ -10475,7 +10539,7 @@
     <w:p>
       <w:pPr>
         <w:rPr>
-          <w:rFonts w:eastAsia="맑은 고딕" w:hint="eastAsia"/>
+          <w:rFonts w:eastAsia="맑은 고딕"/>
           <w:lang w:val="en-AU" w:eastAsia="ko-KR"/>
         </w:rPr>
       </w:pPr>
@@ -26684,6 +26748,18 @@
       <w:u w:val="single"/>
     </w:rPr>
   </w:style>
+  <w:style w:type="character" w:styleId="UnresolvedMention">
+    <w:name w:val="Unresolved Mention"/>
+    <w:basedOn w:val="DefaultParagraphFont"/>
+    <w:uiPriority w:val="99"/>
+    <w:semiHidden/>
+    <w:unhideWhenUsed/>
+    <w:rsid w:val="007D7BD0"/>
+    <w:rPr>
+      <w:color w:val="605E5C"/>
+      <w:shd w:val="clear" w:color="auto" w:fill="E1DFDD"/>
+    </w:rPr>
+  </w:style>
 </w:styles>
 </file>
 

</xml_diff>